<commit_message>
report: in-place results updater (preserves manual edits), table 2 count fix (104 unique filings; 2 same-day duplicate 425 filings merged), user-edited report copy
</commit_message>
<xml_diff>
--- a/docs/reports/이수인_KB구축시스템_진행보고_1031.docx
+++ b/docs/reports/이수인_KB구축시스템_진행보고_1031.docx
@@ -12,7 +12,7 @@
           <w:sz w:val="28"/>
           <w:u w:val="none"/>
         </w:rPr>
-        <w:t>[진행 보고] TRM-Specific Knowledge Base Construction Agentic AI System — 구현 현황과 첫 결과</w:t>
+        <w:t>[진행 보고] TRM-Specific Knowledge Base 구축 에이전트 시스템 구현 현황과 초기 결과</w:t>
       </w:r>
     </w:p>
     <w:p>
@@ -43,14 +43,13 @@
             <w:tcW w:type="dxa" w:w="9016"/>
           </w:tcPr>
           <w:p>
-            <w:r/>
-            <w:r>
-              <w:rPr>
-                <w:b/>
-                <w:sz w:val="16"/>
-                <w:u w:val="none"/>
-              </w:rPr>
-              <w:t>[Summary]</w:t>
+            <w:r>
+              <w:rPr>
+                <w:b/>
+                <w:sz w:val="16"/>
+                <w:u w:val="none"/>
+              </w:rPr>
+              <w:t>[요약]</w:t>
             </w:r>
           </w:p>
           <w:p>
@@ -79,23 +78,7 @@
                 <w:sz w:val="16"/>
                 <w:u w:val="none"/>
               </w:rPr>
-              <w:t xml:space="preserve">을 실제로 구현해 첫 결과를 얻었음. 결과물은 지식베이스(Knowledge Base, 에이전트가 읽고 추론하는 조직된 지식) 자체가 아니라 </w:t>
-            </w:r>
-            <w:r>
-              <w:rPr>
-                <w:b w:val="0"/>
-                <w:sz w:val="16"/>
-                <w:u w:val="single"/>
-              </w:rPr>
-              <w:t>그 지식베이스를 문서로부터 자율적으로 구축하는 에이전트 시스템</w:t>
-            </w:r>
-            <w:r>
-              <w:rPr>
-                <w:b w:val="0"/>
-                <w:sz w:val="16"/>
-                <w:u w:val="none"/>
-              </w:rPr>
-              <w:t>이며, 지식베이스와 로드맵은 그 시스템의 산출물임.</w:t>
+              <w:t>을 구현하고 파일럿 결과를 얻었음. 이 시스템은 공개·내부 문서를 읽어 지식베이스를 구축하고, 구축한 지식베이스를 바탕으로 로드맵을 생성함. 지식베이스와 로드맵은 시스템의 산출물임.</w:t>
             </w:r>
           </w:p>
           <w:p>
@@ -124,7 +107,7 @@
                 <w:sz w:val="16"/>
                 <w:u w:val="none"/>
               </w:rPr>
-              <w:t>로 정함. 2024년 12월 31일 이전의 공개 자료 259건(공시·보도자료·논문·블로그)과 LLM으로 생성한 가상 내부자료 50건(회의록·주간보고·고객/공급사 메일·기술평가서)을 코퍼스로 구성함. 가상 자료에는 모델이 알 수 없는 사실 42건을 미리 심어 두어, 시스템이 그것을 회수했는지로 구축 품질을 측정함.</w:t>
+              <w:t>로 정함. 2024년 12월 31일 이전의 공개 자료와 LLM으로 작성한 가상 내부자료 50건을 코퍼스로 구성함. 가상 자료에는 사전에 정한 사실 42건을 담았고, KB가 이를 얼마나 회수하는지로 구축 품질을 평가함.</w:t>
             </w:r>
           </w:p>
           <w:p>
@@ -137,23 +120,7 @@
                 <w:sz w:val="16"/>
                 <w:u w:val="none"/>
               </w:rPr>
-              <w:t xml:space="preserve">Cambridge IfM의 2014년 양자기술 로드맵 워크숍 보고서(76쪽)를 전수 분석해 </w:t>
-            </w:r>
-            <w:r>
-              <w:rPr>
-                <w:b w:val="0"/>
-                <w:sz w:val="16"/>
-                <w:u w:val="single"/>
-              </w:rPr>
-              <w:t>로드맵이 요구하는 지식 단위를 노드 10종·주장 8종·관계 11종</w:t>
-            </w:r>
-            <w:r>
-              <w:rPr>
-                <w:b w:val="0"/>
-                <w:sz w:val="16"/>
-                <w:u w:val="none"/>
-              </w:rPr>
-              <w:t xml:space="preserve">으로 도출했고, 이를 그대로 지식베이스 스키마로 삼음. 지식베이스는 </w:t>
+              <w:t xml:space="preserve">Cambridge IfM의 2014년 양자기술 로드맵 워크숍 보고서(76쪽)를 분석해 로드맵 구성에 필요한 지식 단위를 노드 10종·주장 8종·관계 11종으로 정리함. 이를 지식베이스 스키마로 사용함. </w:t>
             </w:r>
             <w:r>
               <w:rPr>
@@ -169,7 +136,7 @@
                 <w:sz w:val="16"/>
                 <w:u w:val="none"/>
               </w:rPr>
-              <w:t xml:space="preserve"> 여섯 에이전트가 문서 한 건씩 읽으며 쌓고, 모든 변화는 이벤트 로그로 남겨 실시간 화면으로 재생함.</w:t>
+              <w:t xml:space="preserve"> 여섯 에이전트가 문서를 한 건씩 처리하고, 모든 상태 변화는 이벤트 로그에 기록해 화면에서 재생할 수 있게 함.</w:t>
             </w:r>
           </w:p>
           <w:p>
@@ -182,7 +149,7 @@
                 <w:sz w:val="16"/>
                 <w:u w:val="none"/>
               </w:rPr>
-              <w:t xml:space="preserve">같은 LLM, 같은 프롬프트로 지식베이스 없이 만든 </w:t>
+              <w:t xml:space="preserve">같은 LLM과 프롬프트를 사용해 KB 없이 만든 </w:t>
             </w:r>
             <w:r>
               <w:rPr>
@@ -198,7 +165,7 @@
                 <w:sz w:val="16"/>
                 <w:u w:val="none"/>
               </w:rPr>
-              <w:t xml:space="preserve">과 지식베이스를 연산 ①~⑦로 읽어 만든 </w:t>
+              <w:t xml:space="preserve">과 KB를 연산 ①~⑦로 활용해 만든 </w:t>
             </w:r>
             <w:r>
               <w:rPr>
@@ -214,23 +181,7 @@
                 <w:sz w:val="16"/>
                 <w:u w:val="none"/>
               </w:rPr>
-              <w:t xml:space="preserve">을 비교함. 20건 파일럿에서 </w:t>
-            </w:r>
-            <w:r>
-              <w:rPr>
-                <w:b w:val="0"/>
-                <w:sz w:val="16"/>
-                <w:u w:val="single"/>
-              </w:rPr>
-              <w:t>심은 사실 회수율 89%(관대 기준 100%)</w:t>
-            </w:r>
-            <w:r>
-              <w:rPr>
-                <w:b w:val="0"/>
-                <w:sz w:val="16"/>
-                <w:u w:val="none"/>
-              </w:rPr>
-              <w:t>, Advanced의 36개 항목 중 33개가 근거 문서를 인용했으며(Initial은 0개), 공식 로드맵 마일스톤과의 연도 오차가 3.25년에서 1.0년으로 줄었음. 180건 전체 실행은 보고서 작성 시점에 진행 중임(2절·9절).</w:t>
+              <w:t>을 비교함. 20건 파일럿에서 가상 사실 회수율은 89%(관대한 기준 100%)였음. Advanced는 36개 항목 중 33개에 근거 문서를 인용했고 Initial은 인용 항목이 없었음. 공식 로드맵 마일스톤과의 연도 오차는 3.25년에서 1.0년으로 줄었음. 180건 전체 실행은 보고서 작성 시점에 진행 중임(2절·9절).</w:t>
             </w:r>
           </w:p>
           <w:p>
@@ -243,7 +194,7 @@
                 <w:sz w:val="16"/>
                 <w:u w:val="none"/>
               </w:rPr>
-              <w:t>비용은 지금까지 약 $5.3, 전체 실행 완료까지 약 $12 수준으로 예상됨. 코드는 GitHub(PassionChicken-Leesuin/Advanced-Agentic-TRM)에 공개되어 있음.</w:t>
+              <w:t>현재까지 비용은 약 $5.3이며, 전체 실행을 마치면 약 $12가 들 것으로 예상함. 코드는 GitHub(PassionChicken-Leesuin/Advanced-Agentic-TRM)에 공개함.</w:t>
             </w:r>
           </w:p>
         </w:tc>
@@ -259,12 +210,7 @@
         <w:jc w:val="both"/>
       </w:pPr>
       <w:r>
-        <w:rPr>
-          <w:b/>
-          <w:sz w:val="22"/>
-          <w:u w:val="none"/>
-        </w:rPr>
-        <w:t>1. [무엇을 만들고 있는가: 한 문장과 용어]</w:t>
+        <w:t>1. 시스템 개요와 주요 용어</w:t>
       </w:r>
     </w:p>
     <w:p>
@@ -277,23 +223,7 @@
           <w:sz w:val="16"/>
           <w:u w:val="none"/>
         </w:rPr>
-        <w:t xml:space="preserve">한 문장으로 쓰면, </w:t>
-      </w:r>
-      <w:r>
-        <w:rPr>
-          <w:b/>
-          <w:sz w:val="16"/>
-          <w:u w:val="none"/>
-        </w:rPr>
-        <w:t>‘기업의 자료가 들어올 때마다 그 내용을 로드맵이 요구하는 구조로 정리해 쌓고, 그렇게 쌓인 지식으로 더 나은 로드맵을 만들게 하는 시스템’</w:t>
-      </w:r>
-      <w:r>
-        <w:rPr>
-          <w:b w:val="0"/>
-          <w:sz w:val="16"/>
-          <w:u w:val="none"/>
-        </w:rPr>
-        <w:t>임. 이 문장에 들어 있는 말들을 먼저 정리함(&lt;표 1&gt;). 이하 본문에서 처음 나오는 용어도 같은 방식으로 괄호 안에 풀어 씀.</w:t>
+        <w:t>이 시스템은 기업 자료가 들어올 때마다 로드맵에 필요한 정보로 정리해 저장하고, 이를 바탕으로 로드맵을 만드는 시스템임. 주요 용어는 &lt;표 1&gt;에 정리함. 본문에서 처음 나오는 용어도 괄호 안에 뜻을 덧붙임.</w:t>
       </w:r>
     </w:p>
     <w:p>
@@ -306,7 +236,7 @@
           <w:sz w:val="20"/>
           <w:u w:val="none"/>
         </w:rPr>
-        <w:t>&lt;표 1&gt; 이 보고서에서 쓰는 용어</w:t>
+        <w:t>&lt;표 1&gt; 주요 용어</w:t>
       </w:r>
     </w:p>
     <w:tbl>
@@ -333,7 +263,6 @@
             <w:pPr>
               <w:jc w:val="center"/>
             </w:pPr>
-            <w:r/>
             <w:r>
               <w:rPr>
                 <w:b/>
@@ -353,7 +282,6 @@
             <w:pPr>
               <w:jc w:val="center"/>
             </w:pPr>
-            <w:r/>
             <w:r>
               <w:rPr>
                 <w:b/>
@@ -373,7 +301,6 @@
             <w:pPr>
               <w:jc w:val="center"/>
             </w:pPr>
-            <w:r/>
             <w:r>
               <w:rPr>
                 <w:b/>
@@ -673,14 +600,13 @@
             <w:tcW w:type="dxa" w:w="2716"/>
           </w:tcPr>
           <w:p>
-            <w:r/>
-            <w:r>
-              <w:rPr>
-                <w:b w:val="0"/>
-                <w:sz w:val="16"/>
-                <w:u w:val="none"/>
-              </w:rPr>
-              <w:t>비교 기준선(S0). 선행 TRM 연구는 대부분 이 방식</w:t>
+            <w:r>
+              <w:rPr>
+                <w:b w:val="0"/>
+                <w:sz w:val="16"/>
+                <w:u w:val="none"/>
+              </w:rPr>
+              <w:t>비교 조건(S0)으로 설정함. 문서에서 관련 내용을 찾아 LLM에 제공하는 기본적인 활용 방식임.</w:t>
             </w:r>
           </w:p>
         </w:tc>
@@ -727,14 +653,13 @@
             <w:tcW w:type="dxa" w:w="2716"/>
           </w:tcPr>
           <w:p>
-            <w:r/>
-            <w:r>
-              <w:rPr>
-                <w:b w:val="0"/>
-                <w:sz w:val="16"/>
-                <w:u w:val="none"/>
-              </w:rPr>
-              <w:t>KB의 기본 단위. 로드맵도 결국 노드·링크의 망</w:t>
+            <w:r>
+              <w:rPr>
+                <w:b w:val="0"/>
+                <w:sz w:val="16"/>
+                <w:u w:val="none"/>
+              </w:rPr>
+              <w:t>지식베이스의 기본 단위임. 로드맵 항목과 항목 사이 관계를 표현함.</w:t>
             </w:r>
           </w:p>
         </w:tc>
@@ -889,14 +814,13 @@
             <w:tcW w:type="dxa" w:w="2716"/>
           </w:tcPr>
           <w:p>
-            <w:r/>
-            <w:r>
-              <w:rPr>
-                <w:b w:val="0"/>
-                <w:sz w:val="16"/>
-                <w:u w:val="none"/>
-              </w:rPr>
-              <w:t>1막과 3막. 둘의 차이가 KB의 효과</w:t>
+            <w:r>
+              <w:rPr>
+                <w:b w:val="0"/>
+                <w:sz w:val="16"/>
+                <w:u w:val="none"/>
+              </w:rPr>
+              <w:t>KB 사용 여부에 따른 로드맵 차이를 비교함.</w:t>
             </w:r>
           </w:p>
         </w:tc>
@@ -943,14 +867,13 @@
             <w:tcW w:type="dxa" w:w="2716"/>
           </w:tcPr>
           <w:p>
-            <w:r/>
-            <w:r>
-              <w:rPr>
-                <w:b w:val="0"/>
-                <w:sz w:val="16"/>
-                <w:u w:val="none"/>
-              </w:rPr>
-              <w:t>그 이후 공개된 공식 로드맵을 ‘정답’으로 써서 예측력을 봄</w:t>
+            <w:r>
+              <w:rPr>
+                <w:b w:val="0"/>
+                <w:sz w:val="16"/>
+                <w:u w:val="none"/>
+              </w:rPr>
+              <w:t>기준일 이후 공개된 공식 로드맵을 비교 자료로 사용해 사전 예측 성능을 살펴봄.</w:t>
             </w:r>
           </w:p>
         </w:tc>
@@ -966,12 +889,7 @@
         <w:jc w:val="both"/>
       </w:pPr>
       <w:r>
-        <w:rPr>
-          <w:b/>
-          <w:sz w:val="22"/>
-          <w:u w:val="none"/>
-        </w:rPr>
-        <w:t>2. [대상 기업과 자료: 왜 IonQ인가, 무엇을 넣었나]</w:t>
+        <w:t>2. 분석 대상 기업과 자료</w:t>
       </w:r>
     </w:p>
     <w:p>
@@ -1002,7 +920,7 @@
           <w:sz w:val="16"/>
           <w:u w:val="none"/>
         </w:rPr>
-        <w:t>양자기술 산업에서 기업 하나를 고르는 기준은 세 가지였음. (a) 날짜가 찍힌 1차 자료가 많을 것, (b) 회사가 공식 로드맵을 수치·연도로 공개해 ‘정답’으로 쓸 수 있을 것, (c) 시장·규제·인수처럼 why 층 자료가 있을 것.</w:t>
+        <w:t>기업 선정 기준은 세 가지임. 첫째, 날짜를 확인할 수 있는 1차 자료를 충분히 확보할 수 있을 것. 둘째, 기업이 수치와 연도를 포함한 공식 로드맵을 공개해 비교 기준으로 삼을 수 있을 것. 셋째, 시장·규제·인수 등 why 층을 설명하는 자료가 있을 것.</w:t>
       </w:r>
     </w:p>
     <w:p>
@@ -1024,11 +942,27 @@
       </w:r>
       <w:r>
         <w:rPr>
-          <w:b w:val="0"/>
+          <w:b/>
           <w:sz w:val="16"/>
           <w:u w:val="none"/>
         </w:rPr>
-        <w:t>(미국 메릴랜드, 이온트랩 방식 양자컴퓨터 상장사, NYSE: IONQ)가 세 기준을 모두 충족함. 2020년 12월 로드맵을 공개했고, 2025년 6월 가속 로드맵으로 갱신했으며, 2025년 인수(Oxford Ionics, Lightsynq 등)가 많아 전 층의 사건이 풍부함. 대안으로 Quantinuum, Rigetti를 검토했으나 자료량에서 밀림.</w:t>
+        <w:t xml:space="preserve">(미국 메릴랜드에 본사를 둔 이온트랩 방식 양자컴퓨터 상장사, NYSE: IONQ)는 세 기준을 모두 충족함. 2020년 12월 로드맵을 공개했고, 2025년 6월에는 가속 로드맵을 발표함. 2025년 Oxford Ionics, Lightsynq 등을 인수해 why부터 how까지 관련 자료를 확인할 수 있었음. Quantinuum과 Rigetti도 검토했으나, 공개 자료가 </w:t>
+      </w:r>
+      <w:r>
+        <w:rPr>
+          <w:b/>
+          <w:sz w:val="16"/>
+          <w:u w:val="none"/>
+        </w:rPr>
+        <w:t>IonQ</w:t>
+      </w:r>
+      <w:r>
+        <w:rPr>
+          <w:b/>
+          <w:sz w:val="16"/>
+          <w:u w:val="none"/>
+        </w:rPr>
+        <w:t>보다 적었음.</w:t>
       </w:r>
     </w:p>
     <w:p>
@@ -1046,7 +980,7 @@
           <w:sz w:val="16"/>
           <w:u w:val="none"/>
         </w:rPr>
-        <w:t xml:space="preserve">주의할 점 하나. IonQ의 로드맵은 판마다 측정 단위가 다름. 2020년판은 </w:t>
+        <w:t xml:space="preserve">IonQ 로드맵은 발표 시점에 따라 측정 단위가 다름. 2020년판은 </w:t>
       </w:r>
       <w:r>
         <w:rPr>
@@ -1054,7 +988,7 @@
           <w:sz w:val="16"/>
           <w:u w:val="none"/>
         </w:rPr>
-        <w:t>#AQ(Algorithmic Qubits, IonQ가 만든 ‘실제 알고리즘에 쓸 수 있는 유효 큐비트 수’ 지표)</w:t>
+        <w:t>#AQ(Algorithmic Qubits, 실제 알고리즘에 사용할 수 있는 유효 큐비트 수)</w:t>
       </w:r>
       <w:r>
         <w:rPr>
@@ -1062,7 +996,7 @@
           <w:sz w:val="16"/>
           <w:u w:val="none"/>
         </w:rPr>
-        <w:t>로, 2025년판은 물리 큐비트 수와 논리 큐비트 수로 말함. 따라서 생성 로드맵을 정답과 맞출 때는 숫자가 아니라 마일스톤·역량 단위(모듈화, 오류정정, 지표 교체 자체 등)로 정렬함(6절).</w:t>
+        <w:t>를 사용하고, 2025년판은 물리 큐비트 수와 논리 큐비트 수를 제시함. 따라서 생성한 로드맵과 비교할 때는 수치를 직접 맞추기보다 모듈화·오류정정·측정 지표 변경 등 마일스톤과 역량을 기준으로 비교함(6절).</w:t>
       </w:r>
     </w:p>
     <w:p>
@@ -1088,7 +1022,7 @@
           <w:sz w:val="16"/>
           <w:u w:val="none"/>
         </w:rPr>
-        <w:t>코퍼스(corpus, 시스템에 투입하는 문서 모음)는 실제 공개 자료와 가상 내부자료를 약 2:1로 섞음(&lt;표 2&gt;). 공개 자료는 SEC EDGAR(미국 증권거래위원회 공시 시스템), arXiv(물리·CS 논문 공개 서버), ionq.com에서 스크립트로 내려받아 날짜·출처 메타데이터를 붙인 텍스트로 정규화함. 모두 2024-12-31 이전 자료만 씀.</w:t>
+        <w:t>코퍼스(corpus, 시스템에 투입하는 문서 모음)는 공개 자료와 가상 내부자료로 구성함(&lt;표 2&gt;). 공개 자료는 SEC EDGAR(미국 증권거래위원회 공시 시스템), arXiv(물리·컴퓨터과학 논문 공개 서버), ionq.com에서 내려받고, 날짜와 출처 정보를 붙여 텍스트로 정리함. 자료는 모두 2024년 12월 31일 이전에 공개된 것으로 한정함.</w:t>
       </w:r>
     </w:p>
     <w:p>
@@ -1101,7 +1035,7 @@
           <w:sz w:val="20"/>
           <w:u w:val="none"/>
         </w:rPr>
-        <w:t>&lt;표 2&gt; 코퍼스 구성 (2026-10-31 기준)</w:t>
+        <w:t>&lt;표 2&gt; 코퍼스 구성 (2026년 10월 31일 기준)</w:t>
       </w:r>
     </w:p>
     <w:tbl>
@@ -1227,14 +1161,8 @@
             <w:tcW w:type="dxa" w:w="3900"/>
           </w:tcPr>
           <w:p>
-            <w:r/>
-            <w:r>
-              <w:rPr>
-                <w:b w:val="0"/>
-                <w:sz w:val="16"/>
-                <w:u w:val="none"/>
-              </w:rPr>
-              <w:t>10-K(연차보고서) 6, 10-Q(분기보고서) 13, 8-K 첨부 보도자료 42, SPAC 합병 통신문 45</w:t>
+            <w:r>
+              <w:t>10-K(연차보고서) 6, 10-Q(분기보고서) 13, 8-K 첨부 보도자료 42, SPAC 합병 통신문 43(같은 날 중복 제출 2건은 1건으로 계산)</w:t>
             </w:r>
           </w:p>
         </w:tc>
@@ -1243,14 +1171,8 @@
             <w:tcW w:type="dxa" w:w="700"/>
           </w:tcPr>
           <w:p>
-            <w:r/>
-            <w:r>
-              <w:rPr>
-                <w:b w:val="0"/>
-                <w:sz w:val="16"/>
-                <w:u w:val="none"/>
-              </w:rPr>
-              <w:t>106</w:t>
+            <w:r>
+              <w:t>104</w:t>
             </w:r>
           </w:p>
         </w:tc>
@@ -1559,7 +1481,7 @@
           <w:sz w:val="20"/>
           <w:u w:val="none"/>
         </w:rPr>
-        <w:t>2.3 가상 내부자료와 ‘심은 사실’</w:t>
+        <w:t>2.3 가상 내부자료와 사전에 정한 사실</w:t>
       </w:r>
     </w:p>
     <w:p>
@@ -1577,7 +1499,7 @@
           <w:sz w:val="16"/>
           <w:u w:val="none"/>
         </w:rPr>
-        <w:t>‘기업의 자료가 들어온다’는 상황을 재현하려면 내부 문서가 필요하지만 실제 내부 문서는 구할 수 없음. 그래서 LLM(claude-sonnet-4.6)에게 날짜·유형·등장 역할을 지정해 영어 문서 50건을 쓰게 함. 사람 이름은 쓰지 않고 역할(VP Hardware 등)만 씀.</w:t>
+        <w:t>기업 내부 문서를 실제로 구할 수 없어, 내부 자료가 들어오는 상황을 재현하기 위해 LLM(claude-sonnet-4.6)으로 영어 문서 50건을 작성함. 문서마다 날짜와 유형, 등장 역할을 지정했고, 사람 이름 대신 VP Hardware 같은 역할명만 사용함.</w:t>
       </w:r>
     </w:p>
     <w:p>
@@ -1595,7 +1517,7 @@
           <w:sz w:val="16"/>
           <w:u w:val="none"/>
         </w:rPr>
-        <w:t xml:space="preserve">핵심은 </w:t>
+        <w:t xml:space="preserve">먼저 문서에 담을 </w:t>
       </w:r>
       <w:r>
         <w:rPr>
@@ -1603,7 +1525,7 @@
           <w:sz w:val="16"/>
           <w:u w:val="none"/>
         </w:rPr>
-        <w:t>심은 사실(planted facts)</w:t>
+        <w:t>가상 사실 42건</w:t>
       </w:r>
       <w:r>
         <w:rPr>
@@ -1611,7 +1533,7 @@
           <w:sz w:val="16"/>
           <w:u w:val="none"/>
         </w:rPr>
-        <w:t xml:space="preserve"> 원장임. 문서를 쓰기 전에 ‘Harbor 2D 트랩 칩 수율 23%(2024년 1분기)’, ‘Northfield Pharma가 2큐비트 충실도 99.9% 이상과 #AQ 60 이상을 요구’처럼 허구이지만 그럴듯한 사실 42건을 먼저 적고, 각 사실을 2~3개 문서에 나눠 자연스럽게 녹이게 함. 모델이 학습한 적 없는 사실이므로, 나중에 KB에 들어 있으면 그것은 사전지식이 아니라 시스템이 읽어서 쌓은 것임.</w:t>
+        <w:t>을 별도로 정리함. 예를 들어 ‘Harbor 2D 트랩 칩 수율 23%(2024년 1분기)’와 ‘Northfield Pharma가 2큐비트 충실도 99.9% 이상과 #AQ 60 이상을 요구’ 같은 내용임. 각 사실은 2~3개 문서에 나누어 담음. 이 사실들은 연구를 위해 새로 만든 내용이므로, KB에서 확인되면 시스템이 문서에서 읽어 저장한 것으로 볼 수 있음.</w:t>
       </w:r>
     </w:p>
     <w:p>
@@ -1629,7 +1551,7 @@
           <w:sz w:val="16"/>
           <w:u w:val="none"/>
         </w:rPr>
-        <w:t>사실마다 ‘등장 가능 날짜 창’을 두어 2024년 9월의 결정이 2월 문서에 나오는 시점 오류를 막았고, 3쌍은 일부러 서로 모순되게 넣음(예: 칩 수율 목표 60%→45%로 하향, Tempo 출하 1분기→2분기 지연, 얽힘률 측정 12/s vs 자료 주장 100/s). 모순은 Critic이 잡아야 할 장면임.</w:t>
+        <w:t>각 사실에 문서에 등장할 수 있는 시기를 정해 2024년 9월의 결정이 그해 2월 문서에 등장하는 오류를 막음. 또 세 쌍의 문서에는 서로 다른 내용을 넣음(예: 칩 수율 목표를 60%에서 45%로 낮춤, Tempo 출하를 1분기에서 2분기로 미룸, 얽힘률을 12/s와 100/s로 다르게 기록). 시스템이 이런 차이를 찾아내는지도 확인함.</w:t>
       </w:r>
     </w:p>
     <w:p>
@@ -1644,7 +1566,7 @@
           <w:highlight w:val="yellow"/>
           <w:u w:val="none"/>
         </w:rPr>
-        <w:t>→ 가상 자료의 심은 사실 회수율이 KB 구축 품질의 가장 깨끗한 측정치이고, 공식 로드맵과의 정렬은 그것을 보강하는 두 번째 증거로 둠.</w:t>
+        <w:t>→ 가상 자료에 미리 정한 사실이 KB에 얼마나 반영됐는지를 구축 품질의 직접 지표로 사용함. 공식 로드맵과의 비교는 보조 지표로 둠.</w:t>
       </w:r>
     </w:p>
     <w:p>
@@ -1652,12 +1574,7 @@
         <w:jc w:val="both"/>
       </w:pPr>
       <w:r>
-        <w:rPr>
-          <w:b/>
-          <w:sz w:val="22"/>
-          <w:u w:val="none"/>
-        </w:rPr>
-        <w:t>3. [지식베이스는 무엇으로 이루어지나: Cambridge 보고서에서 도출한 지식 단위]</w:t>
+        <w:t>3. Cambridge 보고서에서 본 지식베이스 구성</w:t>
       </w:r>
     </w:p>
     <w:p>
@@ -1670,7 +1587,7 @@
           <w:sz w:val="16"/>
           <w:u w:val="none"/>
         </w:rPr>
-        <w:t xml:space="preserve">처음에는 ‘역량 주장’(어떤 기술이 언제 어느 수준이 된다는 진술) 하나를 KB의 단위로 생각했음. 그러나 TRM은 훨씬 많은 것을 요구함. 그것이 정확히 무엇인지 보려고 </w:t>
+        <w:t xml:space="preserve">처음에는 ‘역량 주장’(기술이 언제 어느 수준에 도달한다는 진술)을 KB의 기본 단위로 생각했음. 그러나 로드맵에 필요한 정보는 역량 주장만으로 설명되지 않음. 이를 확인하기 위해 </w:t>
       </w:r>
       <w:r>
         <w:rPr>
@@ -1678,7 +1595,7 @@
           <w:sz w:val="16"/>
           <w:u w:val="none"/>
         </w:rPr>
-        <w:t>Cambridge IfM(Institute for Manufacturing)이 2014년 영국 양자기술 상용화를 위해 런던·글래스고에서 연 로드맵 워크숍의 통합 보고서(Trueman, 76쪽)</w:t>
+        <w:t>Cambridge IfM(Institute for Manufacturing)이 2014년 영국 양자기술 상용화를 위해 런던과 글래스고에서 진행한 로드맵 워크숍의 통합 보고서(Trueman, 76쪽)</w:t>
       </w:r>
       <w:r>
         <w:rPr>
@@ -1686,7 +1603,7 @@
           <w:sz w:val="16"/>
           <w:u w:val="none"/>
         </w:rPr>
-        <w:t>를 처음부터 끝까지 분석함. 사람이 실제로 만든 로드맵이 무엇으로 구성되는지 산출물 단위로 역추적한 것임.</w:t>
+        <w:t>를 분석함. 보고서에 담긴 항목과 관계를 살펴 지식 단위를 정리함.</w:t>
       </w:r>
     </w:p>
     <w:p>
@@ -1699,7 +1616,7 @@
           <w:sz w:val="20"/>
           <w:u w:val="none"/>
         </w:rPr>
-        <w:t>3.1 보고서가 담고 있는 것</w:t>
+        <w:t>3.1 보고서의 주요 구성</w:t>
       </w:r>
     </w:p>
     <w:p>
@@ -1717,7 +1634,7 @@
           <w:sz w:val="16"/>
           <w:u w:val="none"/>
         </w:rPr>
-        <w:t>보고서의 산출물은 다섯 묶음임. (a) 층별 항목 목록(트렌드·드라이버 19개, 이해관계자 니즈 15개, 응용 기회 15개, 역량·인에이블러), (b) 층 간 연계 행렬(기회 × 드라이버/니즈/역량/인에이블러, 강도 1~3), (c) 기회별 경로(현재 상태 → 데모 → 1차 제품 → 2차 제품 → 비전), (d) 투표와 링크 수로 계산한 우선순위, (e) 장벽·조치·위험·결정·열린 질문.</w:t>
+        <w:t>보고서의 산출물은 다섯 가지임. (a) 층별 항목 목록: 트렌드·드라이버 19개, 이해관계자 니즈 15개, 응용 기회 15개, 역량·인에이블러, (b) 기회와 드라이버·니즈·역량·인에이블러를 연결한 행렬(강도 1~3), (c) 기회별 경로(현재 상태→데모→1차 제품→2차 제품→비전), (d) 투표와 링크 수를 반영한 우선순위, (e) 장벽·조치·위험·결정·열린 질문.</w:t>
       </w:r>
     </w:p>
     <w:p>
@@ -1730,44 +1647,7 @@
         </w:numPr>
       </w:pPr>
       <w:r>
-        <w:rPr>
-          <w:b w:val="0"/>
-          <w:sz w:val="16"/>
-          <w:u w:val="none"/>
-        </w:rPr>
-        <w:t xml:space="preserve">특히 눈에 띈 것은 사람 로드맵이 </w:t>
-      </w:r>
-      <w:r>
-        <w:rPr>
-          <w:b/>
-          <w:sz w:val="16"/>
-          <w:u w:val="none"/>
-        </w:rPr>
-        <w:t>모르는 것도 기록한다</w:t>
-      </w:r>
-      <w:r>
-        <w:rPr>
-          <w:b w:val="0"/>
-          <w:sz w:val="16"/>
-          <w:u w:val="none"/>
-        </w:rPr>
-        <w:t xml:space="preserve">는 점임(‘칩 가격이 왜 £10인가? 왜 $1이 아닌가?’, ‘다운셀렉션을 3년 안에 해야 하는가?’). 그리고 사양은 단일 수치가 아니라 </w:t>
-      </w:r>
-      <w:r>
-        <w:rPr>
-          <w:b/>
-          <w:sz w:val="16"/>
-          <w:u w:val="none"/>
-        </w:rPr>
-        <w:t>다차원 묶음</w:t>
-      </w:r>
-      <w:r>
-        <w:rPr>
-          <w:b w:val="0"/>
-          <w:sz w:val="16"/>
-          <w:u w:val="none"/>
-        </w:rPr>
-        <w:t>임(관성항법: ‘구두상자 크기, 1시간에 1~10m 정확도, £1~10k, 신뢰도는 중요하지 않음’). 마일스톤에는 단계와 상대 시점이 붙음(‘데모 후 2년 안에 1차 제품’).</w:t>
+        <w:t>워크숍 참가자들은 아직 답하지 못한 질문도 기록함(‘칩 가격이 왜 £10인가? 왜 $1이 아닌가?’, ‘다운셀렉션을 3년 안에 해야 하는가?’). 사양도 단일 수치로 정하지 않고 여러 조건을 함께 적음. 예를 들어 관성항법 장치는 크기, 정확도, 가격을 제시하고 신뢰도는 중요하지 않다고 기록함. 마일스톤에는 단계와 상대 시점도 포함됨(‘데모 후 2년 안에 1차 제품’).</w:t>
       </w:r>
     </w:p>
     <w:p>
@@ -1785,7 +1665,7 @@
           <w:sz w:val="16"/>
           <w:u w:val="none"/>
         </w:rPr>
-        <w:t>워크숍 절차 자체가 본 시스템과 같다는 점도 확인함. 포스트잇 수집(Reader) → 층·범주로 군집(Router) → 연계 그리드(Linker) → 투표·우선순위(Critic) → 시간 밴드 배치(Timing) → 두 워크숍 통합(Summarizer). 보고서 20쪽의 ‘역량·인에이블러 링크는 토픽 사업계획에서 유도했다’는 문장은 Linker가 문서에서 엣지를 추론하는 작업 그대로임.</w:t>
+        <w:t>워크숍에서 정보를 모으고 정리한 순서는 시스템의 처리 단계와 일부 닮아 있음. 포스트잇 수집(Reader)→층·범주별 분류(Router)→항목 간 연결(Linker)→투표와 우선순위 검토(Critic)→시점 배치(Timing)→두 워크숍 결과 통합(Summarizer) 순임. 보고서 20쪽의 ‘역량·인에이블러 링크는 토픽 사업계획에서 유도했다’는 설명은 Linker가 문서에서 관계를 찾는 과정과 연결됨.</w:t>
       </w:r>
     </w:p>
     <w:p>
@@ -1798,7 +1678,7 @@
           <w:sz w:val="20"/>
           <w:u w:val="none"/>
         </w:rPr>
-        <w:t>3.2 도출한 지식 단위: 노드 10종, 주장 8종, 관계 11종</w:t>
+        <w:t>3.2 지식베이스 구성: 노드 10종, 주장 8종, 관계 11종</w:t>
       </w:r>
     </w:p>
     <w:p>
@@ -1811,7 +1691,7 @@
           <w:sz w:val="20"/>
           <w:u w:val="none"/>
         </w:rPr>
-        <w:t>&lt;표 3&gt; 지식베이스 스키마 (KB에 저장되는 것의 종류)</w:t>
+        <w:t>&lt;표 3&gt; 지식베이스 스키마 (저장 정보의 종류)</w:t>
       </w:r>
     </w:p>
     <w:tbl>
@@ -2388,7 +2268,7 @@
           <w:sz w:val="20"/>
           <w:u w:val="none"/>
         </w:rPr>
-        <w:t>3.3 구축 5원칙 (이 표가 KB에서 나오게 하는 조건)</w:t>
+        <w:t>3.3 지식베이스 구축 원칙</w:t>
       </w:r>
     </w:p>
     <w:p>
@@ -2406,7 +2286,7 @@
           <w:sz w:val="16"/>
           <w:u w:val="none"/>
         </w:rPr>
-        <w:t xml:space="preserve">지식의 단위는 엔티티(이름)가 아니라 </w:t>
+        <w:t xml:space="preserve">지식베이스는 엔티티(이름)가 아니라 </w:t>
       </w:r>
       <w:r>
         <w:rPr>
@@ -2414,7 +2294,7 @@
           <w:sz w:val="16"/>
           <w:u w:val="none"/>
         </w:rPr>
-        <w:t>주장</w:t>
+        <w:t>주장 단위</w:t>
       </w:r>
       <w:r>
         <w:rPr>
@@ -2422,7 +2302,7 @@
           <w:sz w:val="16"/>
           <w:u w:val="none"/>
         </w:rPr>
-        <w:t>임. ‘포토닉 인터커넥트’라는 이름만 있으면 로드맵 칸을 채울 수 없고, ‘2025년 말까지 원격 얽힘률 1,000/s 목표’라는 주장이 있어야 함.</w:t>
+        <w:t>로 구성함. ‘포토닉 인터커넥트’라는 이름만으로는 로드맵 내용을 채울 수 없고, ‘2025년 말까지 원격 얽힘률 1,000/s를 달성하는 것이 목표’처럼 구체적인 주장이 필요함.</w:t>
       </w:r>
     </w:p>
     <w:p>
@@ -2440,23 +2320,7 @@
           <w:sz w:val="16"/>
           <w:u w:val="none"/>
         </w:rPr>
-        <w:t xml:space="preserve">Router는 새 주장을 </w:t>
-      </w:r>
-      <w:r>
-        <w:rPr>
-          <w:b/>
-          <w:sz w:val="16"/>
-          <w:u w:val="none"/>
-        </w:rPr>
-        <w:t>기존 역량 행에 정규화</w:t>
-      </w:r>
-      <w:r>
-        <w:rPr>
-          <w:b w:val="0"/>
-          <w:sz w:val="16"/>
-          <w:u w:val="none"/>
-        </w:rPr>
-        <w:t>함. 같은 것을 다른 말로 쓴 문서가 와도 같은 노드에 쌓이게 함.</w:t>
+        <w:t>Router는 새 주장이 기존 역량과 같은 내용을 가리키는지 확인하고 해당 행에 추가함. 같은 역량을 다른 말로 표현해도 같은 노드에 모이도록 함.</w:t>
       </w:r>
     </w:p>
     <w:p>
@@ -2474,23 +2338,7 @@
           <w:sz w:val="16"/>
           <w:u w:val="none"/>
         </w:rPr>
-        <w:t xml:space="preserve">같은 노드의 주장은 </w:t>
-      </w:r>
-      <w:r>
-        <w:rPr>
-          <w:b/>
-          <w:sz w:val="16"/>
-          <w:u w:val="none"/>
-        </w:rPr>
-        <w:t>발언 시점 순으로 보존하고 덮어쓰지 않음</w:t>
-      </w:r>
-      <w:r>
-        <w:rPr>
-          <w:b w:val="0"/>
-          <w:sz w:val="16"/>
-          <w:u w:val="none"/>
-        </w:rPr>
-        <w:t>. 같은 노드에서 측도가 #AQ에서 물리 큐비트로 바뀌면 그것이 곧 ‘지표 교체’이며, 타임라인에 그대로 드러남.</w:t>
+        <w:t>같은 노드에 연결된 주장은 시점별로 모두 보존하고 기존 내용을 덮어쓰지 않음. 측정 지표가 #AQ에서 물리 큐비트 수로 바뀐 경우에도 ‘지표 교체’로 기록해 타임라인에서 확인할 수 있음.</w:t>
       </w:r>
     </w:p>
     <w:p>
@@ -2508,23 +2356,7 @@
           <w:sz w:val="16"/>
           <w:u w:val="none"/>
         </w:rPr>
-        <w:t xml:space="preserve">층을 가로지르는 링크는 </w:t>
-      </w:r>
-      <w:r>
-        <w:rPr>
-          <w:b/>
-          <w:sz w:val="16"/>
-          <w:u w:val="none"/>
-        </w:rPr>
-        <w:t>근거 문서가 하나 이상</w:t>
-      </w:r>
-      <w:r>
-        <w:rPr>
-          <w:b w:val="0"/>
-          <w:sz w:val="16"/>
-          <w:u w:val="none"/>
-        </w:rPr>
-        <w:t xml:space="preserve"> 있어야 수락하고, why→how 직결은 층 위반으로 반려함.</w:t>
+        <w:t>층을 잇는 링크는 근거 문서가 하나 이상 있을 때만 수락함. why에서 how로 바로 연결하는 링크는 층 구조에 맞지 않아 반려함.</w:t>
       </w:r>
     </w:p>
     <w:p>
@@ -2542,23 +2374,7 @@
           <w:sz w:val="16"/>
           <w:u w:val="none"/>
         </w:rPr>
-        <w:t xml:space="preserve">역량 행 단위 </w:t>
-      </w:r>
-      <w:r>
-        <w:rPr>
-          <w:b/>
-          <w:sz w:val="16"/>
-          <w:u w:val="none"/>
-        </w:rPr>
-        <w:t>요약을 바뀐 행만 증분 갱신</w:t>
-      </w:r>
-      <w:r>
-        <w:rPr>
-          <w:b w:val="0"/>
-          <w:sz w:val="16"/>
-          <w:u w:val="none"/>
-        </w:rPr>
-        <w:t>함. 전체를 다시 쓰지 않음.</w:t>
+        <w:t>역량 행의 요약은 내용이 바뀐 행만 갱신함. 전체 요약을 매번 다시 작성하지 않음.</w:t>
       </w:r>
     </w:p>
     <w:p>
@@ -2573,7 +2389,7 @@
           <w:highlight w:val="yellow"/>
           <w:u w:val="none"/>
         </w:rPr>
-        <w:t>→ 원칙을 하나씩 빼면 표가 어떻게 무너지는지가 예측됨. 타임라인을 빼면 시간 열이, 정규화를 빼면 행이, 링크를 빼면 행 사이 이유가, 요약을 빼면 생성기 입력이 사라짐. 이것이 본 실험의 ablation(구성요소 제거 실험) 논리임.</w:t>
+        <w:t>→ 구성 원칙을 하나씩 제외하는 실험으로 각 원칙의 역할을 확인함. 타임라인을 제외하면 시간 정보가, 정규화를 제외하면 항목의 정리 방식이, 링크를 제외하면 항목 간 관계가, 요약을 제외하면 생성기에 제공하는 입력이 달라짐. 이 비교가 본 실험의 ablation(구성요소 제거 실험) 설계임.</w:t>
       </w:r>
     </w:p>
     <w:p>
@@ -2581,12 +2397,7 @@
         <w:jc w:val="both"/>
       </w:pPr>
       <w:r>
-        <w:rPr>
-          <w:b/>
-          <w:sz w:val="22"/>
-          <w:u w:val="none"/>
-        </w:rPr>
-        <w:t>4. [지식베이스를 짓는 에이전트 여섯]</w:t>
+        <w:t>4. 지식베이스 구축 에이전트 여섯 개</w:t>
       </w:r>
     </w:p>
     <w:p>
@@ -2599,7 +2410,7 @@
           <w:sz w:val="16"/>
           <w:u w:val="none"/>
         </w:rPr>
-        <w:t xml:space="preserve">문서 한 건이 들어오면 아래 순서로 처리함. 이것을 에피소드(episode)라 부르고, 에피소드 안의 모든 상태 변화는 </w:t>
+        <w:t xml:space="preserve">문서 한 건을 처리하는 단위를 에피소드(episode)라 부름. 처리 과정에서 생기는 모든 상태 변화는 </w:t>
       </w:r>
       <w:r>
         <w:rPr>
@@ -2607,7 +2418,7 @@
           <w:sz w:val="16"/>
           <w:u w:val="none"/>
         </w:rPr>
-        <w:t>이벤트 로그(events.jsonl, 한 줄에 사건 하나를 시간순으로 덧붙이기만 하는 파일)</w:t>
+        <w:t>이벤트 로그(events.jsonl, 사건을 한 줄씩 시간순으로 기록하는 파일)</w:t>
       </w:r>
       <w:r>
         <w:rPr>
@@ -2615,7 +2426,7 @@
           <w:sz w:val="16"/>
           <w:u w:val="none"/>
         </w:rPr>
-        <w:t>에 남김. 화면 재생·평가가 모두 이 로그 하나를 읽음.</w:t>
+        <w:t>에 남김. 화면 재생과 평가는 이 로그를 사용함.</w:t>
       </w:r>
     </w:p>
     <w:p>
@@ -2696,14 +2507,13 @@
             <w:pPr>
               <w:jc w:val="center"/>
             </w:pPr>
-            <w:r/>
-            <w:r>
-              <w:rPr>
-                <w:b/>
-                <w:sz w:val="16"/>
-                <w:u w:val="none"/>
-              </w:rPr>
-              <w:t>판단 방식</w:t>
+            <w:r>
+              <w:rPr>
+                <w:b/>
+                <w:sz w:val="16"/>
+                <w:u w:val="none"/>
+              </w:rPr>
+              <w:t>처리 방식</w:t>
             </w:r>
           </w:p>
         </w:tc>
@@ -2904,14 +2714,13 @@
             <w:tcW w:type="dxa" w:w="3300"/>
           </w:tcPr>
           <w:p>
-            <w:r/>
-            <w:r>
-              <w:rPr>
-                <w:b w:val="0"/>
-                <w:sz w:val="16"/>
-                <w:u w:val="none"/>
-              </w:rPr>
-              <w:t>병합된 노드에 수치가 있는 새 주장이 오면 기존 주장과 상충하는지 판정해 conflict 표시</w:t>
+            <w:r>
+              <w:rPr>
+                <w:b w:val="0"/>
+                <w:sz w:val="16"/>
+                <w:u w:val="none"/>
+              </w:rPr>
+              <w:t>병합된 노드에 수치가 있는 새 주장이 들어오면 기존 주장과 충돌하는지 검토해 conflict로 표시함.</w:t>
             </w:r>
           </w:p>
         </w:tc>
@@ -3044,14 +2853,13 @@
             <w:tcW w:type="dxa" w:w="3300"/>
           </w:tcPr>
           <w:p>
-            <w:r/>
-            <w:r>
-              <w:rPr>
-                <w:b w:val="0"/>
-                <w:sz w:val="16"/>
-                <w:u w:val="none"/>
-              </w:rPr>
-              <w:t>층 위반은 코드로 즉시 반려, 나머지는 근거 인용이 그 관계를 지지하는지 판정해 수락/반려/보류</w:t>
+            <w:r>
+              <w:rPr>
+                <w:b w:val="0"/>
+                <w:sz w:val="16"/>
+                <w:u w:val="none"/>
+              </w:rPr>
+              <w:t>층 구조 위반은 코드로 반려함. 그 밖의 링크는 근거가 관계를 뒷받침하는지 검토해 수락·반려·보류함.</w:t>
             </w:r>
           </w:p>
         </w:tc>
@@ -3249,7 +3057,7 @@
           <w:sz w:val="16"/>
           <w:u w:val="none"/>
         </w:rPr>
-        <w:t>제안자(Reader·Linker)와 판정자(Critic)의 모델을 다르게 둔 이유는, 같은 모델이 자기 제안을 심사하면 관대해지기 때문임. 모델 조합은 20건 파일럿 세 가지를 비교해 정함(6.1).</w:t>
+        <w:t>제안 역할을 맡는 Reader·Linker와 결과를 검토하는 Critic에 서로 다른 모델을 사용함. 한 모델이 자기 제안까지 검토하면 관대해질 수 있기 때문임. 20건 파일럿에서 세 가지 모델 조합을 비교해 설정을 정함(6.1).</w:t>
       </w:r>
     </w:p>
     <w:p>
@@ -3267,7 +3075,7 @@
           <w:sz w:val="16"/>
           <w:u w:val="none"/>
         </w:rPr>
-        <w:t>속도를 위해 두 가지를 병렬화함. 청크 추출은 8개를 동시에 돌리고, 다음 문서의 Reader 단계를 현재 문서의 Router 이후 단계와 겹침(Router 이후는 KB 상태에 의존하므로 한 문서씩). .env의 OpenRouter 키 20개를 호출마다 돌아가며 써서 키별 속도 제한에 걸리지 않게 함. 결과적으로 문서당 22~63초, 전체 180건은 약 1시간 반.</w:t>
+        <w:t>처리 속도를 높이기 위해 두 작업을 병렬화함. 청크 추출은 8개씩 동시에 진행하고, 다음 문서의 Reader 작업은 현재 문서의 Router 이후 단계와 겹쳐 실행함. Router 이후 단계는 KB 상태에 따라 결과가 달라지므로 한 번에 한 문서씩 처리함. 키별 속도 제한을 피하려고 .env에 저장된 OpenRouter 키 20개를 호출마다 바꿔 사용함. 문서당 처리시간은 22~63초이며, 180건 전체 처리에는 약 1시간 반이 걸릴 것으로 예상함.</w:t>
       </w:r>
     </w:p>
     <w:p>
@@ -3282,7 +3090,7 @@
           <w:highlight w:val="yellow"/>
           <w:u w:val="none"/>
         </w:rPr>
-        <w:t>→ 연구의 핵심 관찰 대상은 Router의 판단 로그임. ‘이 주장을 어느 행에, 어느 구조에 썼는가’가 곧 ‘에이전트가 KB를 어떻게 구축하는가’의 기록임.</w:t>
+        <w:t>→ 연구에서 주로 살펴볼 자료는 Router 로그임. 로그를 통해 각 주장을 어느 행과 구조에 반영했는지 확인할 수 있음.</w:t>
       </w:r>
     </w:p>
     <w:p>
@@ -3290,12 +3098,7 @@
         <w:jc w:val="both"/>
       </w:pPr>
       <w:r>
-        <w:rPr>
-          <w:b/>
-          <w:sz w:val="22"/>
-          <w:u w:val="none"/>
-        </w:rPr>
-        <w:t>5. [지식베이스를 어떻게 ‘쓰는가’: 연산 ①~⑦과 로드맵 생성]</w:t>
+        <w:t>5. 지식베이스를 활용한 연산과 로드맵 생성</w:t>
       </w:r>
     </w:p>
     <w:p>
@@ -3308,7 +3111,7 @@
           <w:sz w:val="16"/>
           <w:u w:val="none"/>
         </w:rPr>
-        <w:t>KB를 잘 짓는 것만으로는 연구가 되지 않음. ‘무엇을 뽑겠다 → 그러려면 KB를 이렇게 짓고 → 그 구조를 이 연산으로 읽어 → 이런 결과물을 뽑는다’가 한 사슬로 이어져야 함. 연구구상의 다섯 기능(①grounding ②트렌드 종합 ③기회 생성 ④링크 추론 ⑤시점 배치)에 ⑥이슈·⑦우선순위를 더해 일곱 연산으로 구현함(&lt;표 5&gt;). 연산은 모두 코드이고(결정적), LLM은 마지막 생성 단계에서만 씀. 그래야 ‘구조의 효과’가 ‘프롬프트의 효과’와 섞이지 않음.</w:t>
+        <w:t>지식베이스를 구축한 뒤에는 어떤 정보를 산출할지 정하고, 필요한 지식 구조와 연산을 연결해야 함. 연구구상에서 정리한 다섯 기능(①grounding ②트렌드 종합 ③기회 생성 ④링크 추론 ⑤시점 배치)에 ⑥이슈와 ⑦우선순위를 더해 일곱 연산으로 구현함(&lt;표 5&gt;). 연산은 코드로 처리하고, LLM은 마지막 로드맵 생성 단계에서만 사용함. 이를 통해 지식 구조의 영향과 프롬프트의 영향을 구분하고자 함.</w:t>
       </w:r>
     </w:p>
     <w:p>
@@ -3321,7 +3124,7 @@
           <w:sz w:val="20"/>
           <w:u w:val="none"/>
         </w:rPr>
-        <w:t>&lt;표 5&gt; KB 사용 연산: 출력 ← 연산 ← 구조</w:t>
+        <w:t>&lt;표 5&gt; 지식베이스 활용 연산: 출력 ← 연산 ← 구조</w:t>
       </w:r>
     </w:p>
     <w:tbl>
@@ -3932,7 +3735,7 @@
           <w:sz w:val="16"/>
           <w:u w:val="none"/>
         </w:rPr>
-        <w:t xml:space="preserve">연산 결과는 항목마다 id를 달고 생성기(gpt-4.1)에 넘김. 생성기는 로드맵 항목에 인용한 id를 적게 되어 있어, 각 항목이 </w:t>
+        <w:t xml:space="preserve">각 연산 결과에 id를 붙여 생성기(gpt-4.1)에 전달함. 생성기는 로드맵 항목에 인용한 id를 표시하므로, 항목이 </w:t>
       </w:r>
       <w:r>
         <w:rPr>
@@ -3940,7 +3743,7 @@
           <w:sz w:val="16"/>
           <w:u w:val="none"/>
         </w:rPr>
-        <w:t>어느 연산이 만든 것인지</w:t>
+        <w:t>어떤 연산에서 나온 것인지</w:t>
       </w:r>
       <w:r>
         <w:rPr>
@@ -3948,7 +3751,7 @@
           <w:sz w:val="16"/>
           <w:u w:val="none"/>
         </w:rPr>
-        <w:t>(produced_by)를 역추적할 수 있음. KB 없이 사전지식으로 만든 항목은 llm_prior로 표시됨.</w:t>
+        <w:t>(produced_by) 추적할 수 있음. KB를 사용하지 않고 사전지식으로 만든 항목은 llm_prior로 표시함.</w:t>
       </w:r>
     </w:p>
     <w:p>
@@ -3966,15 +3769,15 @@
           <w:sz w:val="16"/>
           <w:u w:val="none"/>
         </w:rPr>
-        <w:t>1막과 3막의 공정성</w:t>
-      </w:r>
-      <w:r>
-        <w:rPr>
-          <w:b w:val="0"/>
+        <w:t>비교 조건을 맞추기 위해</w:t>
+      </w:r>
+      <w:r>
+        <w:rPr>
+          <w:b/>
           <w:sz w:val="16"/>
           <w:u w:val="none"/>
         </w:rPr>
-        <w:t>: 기업 소개(2024년 말 기준 한 문단), 지평(2025~2030), 층 안내, 출력 형식, 모델(gpt-4.1), 온도를 모두 고정하고 KB 컨텍스트 블록 하나만 넣고 뺌. 고정 부분의 해시(hash, 내용이 조금만 달라도 값이 바뀌는 지문)를 두 로드맵에 기록해 같은 프롬프트였음을 증명함. gpt-4.1을 고른 이유는 지식 기준일이 2024년 6월이라 2025년 6월의 가속 로드맵을 모르기 때문임.</w:t>
+        <w:t xml:space="preserve"> 기업 소개(2024년 말 기준 한 문단), 분석 기간(2025~2030년), 층 안내, 출력 형식, 모델(gpt-4.1), 온도를 모두 동일하게 설정하고 KB 컨텍스트 블록만 넣거나 제외함. 두 로드맵에 고정 부분의 해시(hash, 내용이 달라지면 값이 바뀌는 지문)를 기록해 프롬프트의 나머지 부분이 같았는지 확인함. gpt-4.1은 지식 기준일이 2024년 6월이므로 2025년 6월에 공개된 가속 로드맵을 알지 못하는 모델로 선택함.</w:t>
       </w:r>
     </w:p>
     <w:p>
@@ -3992,54 +3795,65 @@
           <w:sz w:val="16"/>
           <w:u w:val="none"/>
         </w:rPr>
-        <w:t>diff(차이 계산)</w:t>
-      </w:r>
+        <w:t>차이 분석(diff)</w:t>
+      </w:r>
+      <w:r>
+        <w:rPr>
+          <w:b/>
+          <w:sz w:val="16"/>
+          <w:u w:val="none"/>
+        </w:rPr>
+        <w:t>: Initial과 Advanced의 항목을 같은 층 안에서 임베딩 유사도로 짝지은 뒤, Jansen(2026)의 기준에 따라 LLM이 다섯 유형으로 나눔. 유형은 동일(same), 세분화(refined, Advanced가 더 구체적), 일반화(generalized), 신규(new, Advanced에만 있음), 탈락(dropped, Initial에만 있음)임. 짝지어진 항목은 시점이 어떻게 달라졌는지도 기록함.</w:t>
+      </w:r>
+    </w:p>
+    <w:p>
+      <w:pPr>
+        <w:jc w:val="both"/>
+      </w:pPr>
+      <w:r>
+        <w:t>6. 파일럿 결과와 평가 방법</w:t>
+      </w:r>
+    </w:p>
+    <w:p>
+      <w:pPr>
+        <w:jc w:val="both"/>
+      </w:pPr>
+      <w:r>
+        <w:rPr>
+          <w:b/>
+          <w:sz w:val="20"/>
+          <w:u w:val="none"/>
+        </w:rPr>
+        <w:t>6.1 모델 설정 비교</w:t>
+      </w:r>
+    </w:p>
+    <w:p>
+      <w:pPr>
+        <w:jc w:val="both"/>
+      </w:pPr>
       <w:r>
         <w:rPr>
           <w:b w:val="0"/>
           <w:sz w:val="16"/>
           <w:u w:val="none"/>
         </w:rPr>
-        <w:t>: Initial과 Advanced의 항목을 같은 층 안에서 임베딩 유사도로 짝짓고 LLM이 Jansen(2026)식 다섯 범주로 분류함. 동일(same), 세분화(refined, Advanced가 더 구체적), 일반화(generalized), 신규(new, Advanced에만), 탈락(dropped, Initial에만). 짝이 지어진 항목은 시점 이동도 기록함.</w:t>
-      </w:r>
-    </w:p>
-    <w:p>
-      <w:pPr>
-        <w:jc w:val="both"/>
-      </w:pPr>
+        <w:t xml:space="preserve">가상 자료 10건과 공개 자료 10건(2020년 로드맵 블로그, 2024년 10-K, 논문 2편, 보도자료 등)을 같은 순서로 넣고 세 설정을 비교함(&lt;표 6&gt;). 회수율은 사전에 정한 가상 사실 가운데 KB의 주장이나 근거에서 확인된 비율임. </w:t>
+      </w:r>
       <w:r>
         <w:rPr>
           <w:b/>
-          <w:sz w:val="22"/>
-          <w:u w:val="none"/>
-        </w:rPr>
-        <w:t>6. [검증: 파일럿 결과와 평가 방법]</w:t>
-      </w:r>
-    </w:p>
-    <w:p>
-      <w:pPr>
-        <w:jc w:val="both"/>
-      </w:pPr>
-      <w:r>
-        <w:rPr>
-          <w:b/>
-          <w:sz w:val="20"/>
-          <w:u w:val="none"/>
-        </w:rPr>
-        <w:t>6.1 모델 설정 선정 (같은 20건에 세 설정)</w:t>
-      </w:r>
-    </w:p>
-    <w:p>
-      <w:pPr>
-        <w:jc w:val="both"/>
-      </w:pPr>
+          <w:sz w:val="16"/>
+          <w:u w:val="none"/>
+        </w:rPr>
+        <w:t>평가 모델(gpt-4.1-mini)</w:t>
+      </w:r>
       <w:r>
         <w:rPr>
           <w:b w:val="0"/>
           <w:sz w:val="16"/>
           <w:u w:val="none"/>
         </w:rPr>
-        <w:t>가상 10건 + 공개 10건(2020년 로드맵 블로그, 2024년 10-K, 논문 2편, 보도자료 등)을 같은 순서로 넣고 세 설정을 비교함(&lt;표 6&gt;). 회수율은 심은 사실 중 KB의 주장·근거에서 판정자(gpt-4.1-mini)가 ‘같은 사실이 있다’고 본 비율임(엄격: 수치·날짜까지 일치, 관대: 대상은 있으나 일부 수치 누락 포함).</w:t>
+        <w:t>이 같은 사실로 확인한 경우 회수로 봄. 엄격 기준은 수치와 날짜까지 일치해야 하며, 관대한 기준은 대상은 같지만 일부 수치가 빠진 경우도 포함함.</w:t>
       </w:r>
     </w:p>
     <w:p>
@@ -4052,7 +3866,7 @@
           <w:sz w:val="20"/>
           <w:u w:val="none"/>
         </w:rPr>
-        <w:t>&lt;표 6&gt; 파일럿 비교 (20건 동일)</w:t>
+        <w:t>&lt;표 6&gt; 파일럿 비교 (동일 문서 20건)</w:t>
       </w:r>
     </w:p>
     <w:tbl>
@@ -4600,7 +4414,7 @@
           <w:sz w:val="16"/>
           <w:u w:val="none"/>
         </w:rPr>
-        <w:t>haiku는 사실을 잘 건지고 싸지만 긴 입력에서 빈 응답을 내는 일이 있어 Reader에만 쓰고, 나머지 역할은 JSON 출력이 안정적인 gpt-4.1-mini로 둠. Critic은 sonnet이 가장 엄격함(A2에서 링크 123건 반려).</w:t>
+        <w:t>haiku는 가상 사실을 잘 추출하고 비용도 낮았지만, 긴 입력에서 응답이 비는 경우가 있어 Reader에만 사용함. 나머지 역할에는 JSON 출력이 안정적인 gpt-4.1-mini를 사용함. Critic 검토는 sonnet이 가장 엄격했으며, A2에서는 링크 제안 123건을 반려함.</w:t>
       </w:r>
     </w:p>
     <w:p>
@@ -4618,7 +4432,7 @@
           <w:sz w:val="16"/>
           <w:u w:val="none"/>
         </w:rPr>
-        <w:t>첫 파일럿의 회수율은 17%였음. 원인은 트리아지가 보도자료·내부 메일을 ‘무관’으로 걸러낸 것, 긴 문서에서 Reader의 출력이 잘린 것, 주장에서 수치가 빠진 것, 모델이 잘못된 유형 이름을 써서 제안이 통째로 버려진 것이었음. 네 가지를 고친 뒤 89%가 됨.</w:t>
+        <w:t>첫 파일럿의 회수율은 17%였음. 트리아지가 보도자료와 내부 메일을 ‘무관’으로 분류한 점, 긴 문서에서 Reader의 출력이 잘린 점, 주장에 수치가 빠진 점, 모델이 유형명을 잘못 써 제안이 버려진 점이 원인이었음. 이 네 부분을 보완한 뒤 회수율이 89%로 높아짐.</w:t>
       </w:r>
     </w:p>
     <w:p>
@@ -4631,7 +4445,7 @@
           <w:sz w:val="20"/>
           <w:u w:val="none"/>
         </w:rPr>
-        <w:t>6.2 공식 로드맵과의 정렬 (정답표)</w:t>
+        <w:t>6.2 공식 로드맵과의 비교 기준</w:t>
       </w:r>
     </w:p>
     <w:p>
@@ -4649,7 +4463,7 @@
           <w:sz w:val="16"/>
           <w:u w:val="none"/>
         </w:rPr>
-        <w:t>IonQ 공식 로드맵에서 마일스톤 19건을 역량 단위로 뽑아 정답표를 만듦. 2020년판 9건(#AQ 지표 도입, 32큐비트/22AQ 시스템, 2023년 모듈화, 2025년 광범위 양자우위 등)과 2025년판 10건(2027년 단일 칩 1만 물리 큐비트, 2028년 두 칩 연결 2만, 2030년 200만 물리/4~8만 논리, 지표 교체 자체 등). 2025년판은 cutoff 이후 자료이므로 ‘KB가 변화를 앞서 봤는가’(선견)의 지표가 됨.</w:t>
+        <w:t>IonQ 공식 로드맵에서 마일스톤 19건을 역량 단위로 정리해 비교 기준을 마련함. 2020년판에서 9건(#AQ 지표 도입, 32큐비트/22AQ 시스템, 2023년 모듈화, 2025년 광범위 양자우위 등), 2025년판에서 10건(2027년 단일 칩 1만 물리 큐비트, 2028년 두 칩 연결 2만, 2030년 200만 물리 큐비트와 4~8만 논리 큐비트, 지표 교체 등)을 추림. 2025년판은 KB에 넣은 자료의 기준일 이후에 공개됐으므로, 공개 전 자료로 이후 변화를 얼마나 포착했는지 살펴보는 데 사용함.</w:t>
       </w:r>
     </w:p>
     <w:p>
@@ -4667,7 +4481,7 @@
           <w:sz w:val="16"/>
           <w:u w:val="none"/>
         </w:rPr>
-        <w:t>정렬 절차: 정답 마일스톤마다 로드맵 항목을 임베딩으로 추려 LLM이 match/refined/generalized/missed로 판정. 지표는 recall(엄격 = match+refined, 관대 = generalized 포함), 판별(2020/2025) recall, 짝이 지어진 항목의 연도 오차 MAE.</w:t>
+        <w:t>비교할 때는 각 마일스톤과 유사한 로드맵 항목을 임베딩으로 찾고, LLM이 match/refined/generalized/missed 네 유형으로 분류함. 지표는 재현율(recall: 엄격 기준은 match와 refined, 관대한 기준은 generalized 포함), 2020년판·2025년판별 재현율, 짝지어진 항목의 연도 오차(MAE)임.</w:t>
       </w:r>
     </w:p>
     <w:p>
@@ -4680,7 +4494,7 @@
           <w:sz w:val="20"/>
           <w:u w:val="none"/>
         </w:rPr>
-        <w:t>6.3 파일럿 D의 1막 vs 3막</w:t>
+        <w:t>6.3 파일럿 D의 KB 사용 전후 비교</w:t>
       </w:r>
     </w:p>
     <w:p>
@@ -4693,7 +4507,7 @@
           <w:sz w:val="20"/>
           <w:u w:val="none"/>
         </w:rPr>
-        <w:t>&lt;표 7&gt; 파일럿 D (20건 KB) 결과</w:t>
+        <w:t>&lt;표 7&gt; 파일럿 D 결과 (KB 문서 20건)</w:t>
       </w:r>
     </w:p>
     <w:tbl>
@@ -4890,14 +4704,13 @@
             <w:shd w:val="clear" w:color="auto" w:fill="FAE2D5"/>
           </w:tcPr>
           <w:p>
-            <w:r/>
-            <w:r>
-              <w:rPr>
-                <w:b/>
-                <w:sz w:val="16"/>
-                <w:u w:val="none"/>
-              </w:rPr>
-              <w:t>심은 사실 회수율 (KB)</w:t>
+            <w:r>
+              <w:rPr>
+                <w:b/>
+                <w:sz w:val="16"/>
+                <w:u w:val="none"/>
+              </w:rPr>
+              <w:t>가상 사실 회수율 (KB)</w:t>
             </w:r>
           </w:p>
         </w:tc>
@@ -5052,14 +4865,13 @@
             <w:shd w:val="clear" w:color="auto" w:fill="FAE2D5"/>
           </w:tcPr>
           <w:p>
-            <w:r/>
-            <w:r>
-              <w:rPr>
-                <w:b/>
-                <w:sz w:val="16"/>
-                <w:u w:val="none"/>
-              </w:rPr>
-              <w:t>2025년판 recall (관대, 선견)</w:t>
+            <w:r>
+              <w:rPr>
+                <w:b/>
+                <w:sz w:val="16"/>
+                <w:u w:val="none"/>
+              </w:rPr>
+              <w:t>2025년판 recall (관대, 사전 예측)</w:t>
             </w:r>
           </w:p>
         </w:tc>
@@ -5171,7 +4983,7 @@
           <w:sz w:val="16"/>
           <w:u w:val="none"/>
         </w:rPr>
-        <w:t>20건짜리 작은 KB로는 Advanced가 내부 가상 항목(Harbor 칩 로트, Northfield 파일럿, 공급사 납기)에 치우쳐 공식 마일스톤 재현율이 Initial보다 낮게 나옴. 이는 KB가 ‘읽은 것’을 충실히 반영한다는 뜻이기도 함. 근거 부착률(0→33/36)과 연도 오차(3.25→1.0년)는 분명히 개선됨.</w:t>
+        <w:t>문서 20건으로 진행한 파일럿에서는 Advanced가 Harbor 칩 로트, Northfield 파일럿, 공급사 납기 등 가상 내부자료의 세부 내용을 많이 반영함. 공식 마일스톤 재현율은 Initial보다 낮았음. KB에 담긴 자료를 충실히 반영한 결과로 볼 수 있음. 근거 문서를 인용한 항목은 Initial의 0개에서 Advanced의 36개 중 33개로 늘었고, 연도 오차도 3.25년에서 1.0년으로 줄었음.</w:t>
       </w:r>
     </w:p>
     <w:p>
@@ -5189,7 +5001,7 @@
           <w:sz w:val="16"/>
           <w:u w:val="none"/>
         </w:rPr>
-        <w:t>모순 탐지율은 파일럿에서 측정 불가였음. 모순 쌍의 양쪽이 같은 20건 안에 들어 있지 않았기 때문이며, 전체 실행에서 측정함.</w:t>
+        <w:t>파일럿에서는 모순 탐지율을 계산하지 못함. 모순된 내용 두 가지가 같은 20건 안에 함께 들어 있지 않았기 때문이며, 전체 실행에서 측정할 예정임.</w:t>
       </w:r>
     </w:p>
     <w:p>
@@ -5204,7 +5016,7 @@
           <w:highlight w:val="yellow"/>
           <w:u w:val="none"/>
         </w:rPr>
-        <w:t>→ 공식 로드맵 재현율은 180건 전체 실행 결과로 다시 봐야 함. 작은 KB에서 Advanced가 Initial을 못 이기는 것은 정상이고, 전체 실행에서도 그렇다면 연산 ⑦(우선순위)이 공개 자료의 큰 마일스톤을 내부 세부 항목보다 위로 올리도록 손봐야 함.</w:t>
+        <w:t>→ 공식 로드맵과의 비교는 180건 전체 실행이 끝난 뒤 다시 확인할 필요가 있음. 20건 파일럿만으로 Advanced의 공식 마일스톤 재현율을 판단하기는 어려움. 전체 실행에서도 재현율이 낮다면 연산 ⑦의 우선순위를 조정해 공개 자료의 주요 마일스톤이 내부자료의 세부 항목보다 먼저 반영되도록 보완할 계획임.</w:t>
       </w:r>
     </w:p>
     <w:p>
@@ -5212,12 +5024,7 @@
         <w:jc w:val="both"/>
       </w:pPr>
       <w:r>
-        <w:rPr>
-          <w:b/>
-          <w:sz w:val="22"/>
-          <w:u w:val="none"/>
-        </w:rPr>
-        <w:t>7. [화면: 지식이 쌓이는 장면과 달라진 로드맵]</w:t>
+        <w:t>7. 시스템 화면과 로드맵 변화</w:t>
       </w:r>
     </w:p>
     <w:p>
@@ -5230,7 +5037,7 @@
           <w:sz w:val="16"/>
           <w:u w:val="none"/>
         </w:rPr>
-        <w:t>데모 3막 구성(10월 23일 초안 &lt;그림 2&gt;)을 그대로 웹 화면으로 구현함. FastAPI(파이썬 웹 서버)가 이벤트 로그를 SSE(Server-Sent Events, 서버가 브라우저로 사건을 한 줄씩 밀어주는 방식)로 흘리고, D3(브라우저 그래프 그리기 라이브러리)가 받아 그림. 기록 재생(속도 조절)과 실시간 추적을 같은 화면으로 처리하므로 발표 때는 기록 재생을 써서 API 지연·실패를 차단함.</w:t>
+        <w:t>10월 23일 연구계획 초안의 데모 3막 구성을 웹 화면으로 구현함(&lt;그림 2&gt;). FastAPI(파이썬 웹 서버)가 이벤트 로그를 SSE(Server-Sent Events)로 브라우저에 전달하고, D3(브라우저 그래프 라이브러리)가 이를 화면에 표시함. 기록 재생과 실시간 추적을 모두 지원함. 발표에서는 실시간 API 호출에 따른 지연이나 오류를 피하기 위해 기록을 재생할 예정임.</w:t>
       </w:r>
     </w:p>
     <w:p>
@@ -5282,7 +5089,7 @@
           <w:sz w:val="18"/>
           <w:u w:val="none"/>
         </w:rPr>
-        <w:t>&lt;그림 1&gt; 2막: KB가 구축되는 장면 (파일럿 D, 20건 투입 완료 시점)</w:t>
+        <w:t>&lt;그림 1&gt; 2막 지식베이스 구축 화면 (파일럿 D, 문서 20건 처리 후)</w:t>
       </w:r>
     </w:p>
     <w:p>
@@ -5300,7 +5107,7 @@
           <w:sz w:val="16"/>
           <w:u w:val="none"/>
         </w:rPr>
-        <w:t>세로는 다섯 레인(why / what / how / 자원 / 횡단), 가로는 시간축(know-when). 시간 정보가 있는 노드는 ES 위치에 고정되고 없는 노드는 레인 안에서 힘 기반 배치(force layout)로 퍼짐. 노드 크기는 근거 수, 라벨은 두 문서 이상이 말한 행만 상시 표시하고 나머지는 마우스를 올리면 보임.</w:t>
+        <w:t>화면의 세로축은 다섯 레인(why / what / how / 자원 / 횡단), 가로축은 시간(know-when)을 나타냄. 시간 정보가 있는 노드는 ES 위치에 두고, 없는 노드는 레인 안에서 힘 기반 배치(force layout)로 배치함. 노드 크기는 연결된 근거 수를 나타냄. 두 문서 이상에서 언급된 행은 라벨을 계속 표시하고, 나머지는 마우스를 올렸을 때 표시함.</w:t>
       </w:r>
     </w:p>
     <w:p>
@@ -5318,7 +5125,7 @@
           <w:sz w:val="16"/>
           <w:u w:val="none"/>
         </w:rPr>
-        <w:t>Linker의 제안은 점선, Critic이 수락하면 실선, 반려하면 붉은 점선으로 바뀐 뒤 사라짐. 모순이 잡힌 노드는 주황 테두리. 오른쪽에는 에이전트 여섯의 상태등과 마지막 행동, 문서 진행바, KB 통계, 이벤트 로그가 있음.</w:t>
+        <w:t>Linker가 제안한 링크는 점선으로 표시함. Critic이 수락하면 실선으로 바뀌고, 반려된 링크는 붉은 점선으로 표시한 뒤 화면에서 제거함. 모순이 발견된 노드는 주황색 테두리로 나타냄. 화면 오른쪽에는 여섯 에이전트의 상태와 마지막 작업, 문서 처리 진행률, KB 통계, 이벤트 로그를 배치함.</w:t>
       </w:r>
     </w:p>
     <w:p>
@@ -5370,7 +5177,7 @@
           <w:sz w:val="18"/>
           <w:u w:val="none"/>
         </w:rPr>
-        <w:t>&lt;그림 2&gt; 1막·3막: Initial(왼쪽)과 Advanced(오른쪽) 로드맵과 diff 색상</w:t>
+        <w:t>&lt;그림 2&gt; Initial(왼쪽)·Advanced(오른쪽) 로드맵과 항목 변화 표시</w:t>
       </w:r>
     </w:p>
     <w:p>
@@ -5388,7 +5195,7 @@
           <w:sz w:val="16"/>
           <w:u w:val="none"/>
         </w:rPr>
-        <w:t>오른쪽 Advanced에서 초록은 신규, 파랑 테두리는 세분화, 회색은 동일, 점선은 일반화. 왼쪽 Initial에서 점선 테두리는 탈락한 항목. 막대 끝의 숫자 배지는 근거 문서 수이고, 기술이 수요보다 늦은 항목은 붉은 테두리(infeasible)로 표시됨. 범례의 ‘근거 있는 신규 23/23’이 3막의 핵심 메시지임.</w:t>
+        <w:t>Advanced에서는 초록색으로 신규 항목, 파란색 테두리로 세분화된 항목, 회색으로 동일 항목, 점선으로 일반화된 항목을 표시함. Initial에서 점선 테두리는 Advanced에서 빠진 항목을 뜻함. 막대 끝의 숫자는 근거 문서 수이며, 기술 준비 시점이 수요보다 늦은 항목은 붉은 테두리(infeasible)로 표시함. Advanced에 추가된 23개 항목 모두 근거 문서가 연결된 점을 함께 보여줌.</w:t>
       </w:r>
     </w:p>
     <w:p>
@@ -5406,7 +5213,7 @@
           <w:sz w:val="16"/>
           <w:u w:val="none"/>
         </w:rPr>
-        <w:t>화면 라벨은 사전 파일 하나(i18n)에 모아 두어 영어 전환 시 그 파일만 채우면 됨.</w:t>
+        <w:t>화면 문구는 i18n 파일 한 곳에서 관리함. 영어 화면이 필요하면 이 파일의 문구를 채우면 됨.</w:t>
       </w:r>
     </w:p>
     <w:p>
@@ -5414,12 +5221,7 @@
         <w:jc w:val="both"/>
       </w:pPr>
       <w:r>
-        <w:rPr>
-          <w:b/>
-          <w:sz w:val="22"/>
-          <w:u w:val="none"/>
-        </w:rPr>
-        <w:t>8. [비용과 속도]</w:t>
+        <w:t>8. 비용과 처리 시간</w:t>
       </w:r>
     </w:p>
     <w:p>
@@ -5432,7 +5234,7 @@
           <w:sz w:val="20"/>
           <w:u w:val="none"/>
         </w:rPr>
-        <w:t>&lt;표 8&gt; 지금까지의 비용 (OpenRouter 실측)</w:t>
+        <w:t>&lt;표 8&gt; 현재까지의 비용 (OpenRouter 사용 내역)</w:t>
       </w:r>
     </w:p>
     <w:tbl>
@@ -5576,14 +5378,13 @@
             <w:shd w:val="clear" w:color="auto" w:fill="FAE2D5"/>
           </w:tcPr>
           <w:p>
-            <w:r/>
-            <w:r>
-              <w:rPr>
-                <w:b/>
-                <w:sz w:val="16"/>
-                <w:u w:val="none"/>
-              </w:rPr>
-              <w:t>로드맵 생성·diff·평가 판정자</w:t>
+            <w:r>
+              <w:rPr>
+                <w:b/>
+                <w:sz w:val="16"/>
+                <w:u w:val="none"/>
+              </w:rPr>
+              <w:t>로드맵 생성·차이 분석·평가 모델</w:t>
             </w:r>
           </w:p>
         </w:tc>
@@ -5701,7 +5502,7 @@
           <w:sz w:val="16"/>
           <w:u w:val="none"/>
         </w:rPr>
-        <w:t>문서당 비용의 약 40%가 Critic(sonnet)임. 본 실험에서 구조 조건(S0~S4)별로 KB를 여러 번 지어야 한다면 Critic을 gpt-4.1이나 배치 가격으로 바꾸는 것이 절감 지점임. 데모 한 세트에는 그대로 둠.</w:t>
+        <w:t>문서당 비용의 약 40%가 Critic(sonnet)에서 발생함. 본 실험에서 구조 조건(S0~S4)별로 KB를 여러 번 구축한다면, Critic을 gpt-4.1로 바꾸거나 배치 가격을 적용해 비용을 줄일 수 있음. 데모에서는 현재 설정을 유지함.</w:t>
       </w:r>
     </w:p>
     <w:p>
@@ -5719,7 +5520,7 @@
           <w:sz w:val="16"/>
           <w:u w:val="none"/>
         </w:rPr>
-        <w:t>속도는 문서당 55초(최적화 전)에서 22~63초로 줄었고, 가장 긴 것은 14청크짜리 10-K·논문(약 60초)임.</w:t>
+        <w:t>최적화 전 문서당 처리시간은 약 55초였고, 최적화 후에는 22~63초로 측정됨. 처리시간이 가장 긴 문서는 14개 청크로 나눈 10-K와 논문으로, 약 60초가 걸림.</w:t>
       </w:r>
     </w:p>
     <w:p>
@@ -5727,12 +5528,7 @@
         <w:jc w:val="both"/>
       </w:pPr>
       <w:r>
-        <w:rPr>
-          <w:b/>
-          <w:sz w:val="22"/>
-          <w:u w:val="none"/>
-        </w:rPr>
-        <w:t>9. [남은 일과 열린 질문]</w:t>
+        <w:t>9. 후속 작업과 한계</w:t>
       </w:r>
     </w:p>
     <w:p>
@@ -5750,15 +5546,14 @@
           <w:sz w:val="16"/>
           <w:u w:val="none"/>
         </w:rPr>
-        <w:t>전체 실행 결과 반영</w:t>
-      </w:r>
-      <w:r>
-        <w:rPr>
-          <w:b w:val="0"/>
+        <w:t>180건 전체 실행 후 회수율·모순 탐지율과 공식 로드맵 비교 결과를 반영해 &lt;표 7&gt;을 갱신할 예정임.</w:t>
+      </w:r>
+      <w:r>
+        <w:rPr>
+          <w:b/>
           <w:sz w:val="16"/>
           <w:u w:val="none"/>
         </w:rPr>
-        <w:t>: 180건 KB로 Advanced를 다시 생성하고, 회수율·모순 탐지율·공식 로드맵 정렬(특히 2025년판 선견)을 산출해 &lt;표 7&gt;을 갱신함. 마무리 스크립트 한 번으로 돌아가게 준비되어 있음.</w:t>
       </w:r>
     </w:p>
     <w:p>
@@ -5776,15 +5571,15 @@
           <w:sz w:val="16"/>
           <w:u w:val="none"/>
         </w:rPr>
-        <w:t>Generator 모델 2종</w:t>
-      </w:r>
-      <w:r>
-        <w:rPr>
-          <w:b w:val="0"/>
+        <w:t>생성 모델 비교</w:t>
+      </w:r>
+      <w:r>
+        <w:rPr>
+          <w:b/>
           <w:sz w:val="16"/>
           <w:u w:val="none"/>
         </w:rPr>
-        <w:t>: 연구구상 §5.1의 요구대로 gpt-4.1 외에 한 모델을 더 돌려 결과가 모델에 의존하지 않는지 확인함(약 $0.3).</w:t>
+        <w:t>: 연구구상 §5.1에 따라 gpt-4.1 외에 다른 모델 하나를 추가로 실행해 결과가 특정 모델에 좌우되는지 확인할 예정임(약 $0.3).</w:t>
       </w:r>
     </w:p>
     <w:p>
@@ -5802,15 +5597,15 @@
           <w:sz w:val="16"/>
           <w:u w:val="none"/>
         </w:rPr>
-        <w:t>본 실험과의 연결</w:t>
-      </w:r>
-      <w:r>
-        <w:rPr>
-          <w:b w:val="0"/>
+        <w:t>본 실험 설계</w:t>
+      </w:r>
+      <w:r>
+        <w:rPr>
+          <w:b/>
           <w:sz w:val="16"/>
           <w:u w:val="none"/>
         </w:rPr>
-        <w:t>: 지금의 KB는 S4(제안 구조)임. 같은 이벤트 로그에서 구조를 하나씩 빼는 방식(S0 평면 RAG, S1 계층 요약만, S2 엔티티 그래프만, S3 합집합, S4-a~d ablation)으로 비교 조건을 만들 수 있음. 연산 ①~⑦이 구조별로 어디서 막히는지가 곧 ‘로드맵이 이 구조를 요구한다’의 증거가 됨.</w:t>
+        <w:t>: 현재 KB는 S4(제안 구조)임. 같은 이벤트 로그에서 구조를 하나씩 제외해 S0 평면 RAG, S1 계층 요약만, S2 엔티티 그래프만, S3 합집합, S4-a~d 제거 조건을 만들 수 있음. 연산 ①~⑦이 각 구조에서 어떻게 작동하는지 비교해 로드맵 생성에 필요한 지식 구조를 살펴볼 예정임.</w:t>
       </w:r>
     </w:p>
     <w:p>
@@ -5832,11 +5627,11 @@
       </w:r>
       <w:r>
         <w:rPr>
-          <w:b w:val="0"/>
+          <w:b/>
           <w:sz w:val="16"/>
           <w:u w:val="none"/>
         </w:rPr>
-        <w:t>: (a) 공개 자료의 사실은 모델이 이미 알 수 있으므로 사전지식 오염은 심은 사실과 cutoff 전후 구간 분리로만 통제됨. (b) 가상 자료가 KB의 1/3이라 Advanced가 내부 세부 항목에 치우칠 수 있음(6.3). (c) Router의 병합 임계값(0.80/0.65)은 파일럿 로그로 정한 값이라 다른 도메인에서는 재조정이 필요함. (d) 모순 탐지는 수치가 있는 주장에만 걸어 두어 서술형 모순은 놓침.</w:t>
+        <w:t>: (a) 공개 자료는 모델의 사전지식과 겹칠 수 있어, 가상 사실 회수율과 cutoff 전후 자료로만 구분할 수 있음. (b) 가상 자료가 KB의 1/3이라 Advanced가 내부 세부 항목에 치우칠 수 있음(6.3). (c) Router 병합 기준(0.80/0.65)은 파일럿에서 정해 다른 분야에 맞게 조정해야 함. (d) 모순 탐지는 수치가 있는 주장에만 적용하므로 서술형 모순은 놓칠 수 있음.</w:t>
       </w:r>
     </w:p>
     <w:p>
@@ -5854,28 +5649,25 @@
           <w:sz w:val="16"/>
           <w:u w:val="none"/>
         </w:rPr>
-        <w:t>패키징</w:t>
+        <w:t>발표와 공유</w:t>
+      </w:r>
+      <w:r>
+        <w:rPr>
+          <w:b/>
+          <w:sz w:val="16"/>
+          <w:u w:val="none"/>
+        </w:rPr>
+        <w:t>: 화면 재생을 녹화하고 영어 문구를 준비해 Cambridge 계획서에 데모를 반영함. 코드는 GitHub에 올렸고 테스트 25개가 통과함.</w:t>
       </w:r>
       <w:r>
         <w:rPr>
           <w:b w:val="0"/>
-          <w:sz w:val="16"/>
-          <w:u w:val="none"/>
-        </w:rPr>
-        <w:t>: 재생 녹화, 화면 영어 전환, Cambridge 계획서 docx에 데모 절 반영.</w:t>
-      </w:r>
-    </w:p>
-    <w:p>
-      <w:pPr>
-        <w:jc w:val="both"/>
-      </w:pPr>
+        </w:rPr>
+      </w:r>
       <w:r>
         <w:rPr>
           <w:b w:val="0"/>
-          <w:sz w:val="16"/>
-          <w:u w:val="none"/>
-        </w:rPr>
-        <w:t>지금까지의 코드는 모두 GitHub(PassionChicken-Leesuin/Advanced-Agentic-TRM, main)에 단계별 커밋으로 올라가 있고, 테스트 25개가 통과하며, 공개 코퍼스는 스크립트 한 번으로 재수집됩니다. 전체 실행이 끝나는 대로 결과표를 채워 다시 공유드리겠습니다!</w:t>
+        </w:rPr>
       </w:r>
     </w:p>
     <w:sectPr>

</xml_diff>

<commit_message>
full run (full) results: finalize, ablation, contrast tasks, model2, report update, static site
</commit_message>
<xml_diff>
--- a/docs/reports/이수인_KB구축시스템_진행보고_1031.docx
+++ b/docs/reports/이수인_KB구축시스템_진행보고_1031.docx
@@ -149,39 +149,7 @@
                 <w:sz w:val="16"/>
                 <w:u w:val="none"/>
               </w:rPr>
-              <w:t xml:space="preserve">같은 LLM과 프롬프트를 사용해 KB 없이 만든 </w:t>
-            </w:r>
-            <w:r>
-              <w:rPr>
-                <w:b/>
-                <w:sz w:val="16"/>
-                <w:u w:val="none"/>
-              </w:rPr>
-              <w:t>Initial Roadmap</w:t>
-            </w:r>
-            <w:r>
-              <w:rPr>
-                <w:b w:val="0"/>
-                <w:sz w:val="16"/>
-                <w:u w:val="none"/>
-              </w:rPr>
-              <w:t xml:space="preserve">과 KB를 연산 ①~⑦로 활용해 만든 </w:t>
-            </w:r>
-            <w:r>
-              <w:rPr>
-                <w:b/>
-                <w:sz w:val="16"/>
-                <w:u w:val="none"/>
-              </w:rPr>
-              <w:t>Advanced Roadmap</w:t>
-            </w:r>
-            <w:r>
-              <w:rPr>
-                <w:b w:val="0"/>
-                <w:sz w:val="16"/>
-                <w:u w:val="none"/>
-              </w:rPr>
-              <w:t>을 비교함. 20건 파일럿에서 가상 사실 회수율은 89%(관대한 기준 100%)였음. Advanced는 36개 항목 중 33개에 근거 문서를 인용했고 Initial은 인용 항목이 없었음. 공식 로드맵 마일스톤과의 연도 오차는 3.25년에서 1.0년으로 줄었음. 180건 전체 실행은 보고서 작성 시점에 진행 중임(2절·9절).</w:t>
+              <w:t>같은 LLM과 프롬프트를 사용해 KB 없이 만든 Initial Roadmap과 KB를 연산 ①~⑦로 활용해 만든 Advanced Roadmap을 비교함. 180건 전체 실행 결과 KB는 노드 2202개, 주장 3912개, 수락 링크 711개로 구성됨. 가상 사실 회수율은 93%(관대한 기준 100%)였음. Advanced는 30개 항목 중 29개에 근거 문서를 인용했고 Initial은 0개였음. 공식 로드맵 마일스톤 재현율(관대)은 Initial 53%, Advanced 47%이며, 기준일 이후 공개된 2025년판 마일스톤의 사전 예측 재현율은 60%에서 50%로, 연도 오차는 3.75년에서 1.71년으로 바뀜(6절).</w:t>
             </w:r>
           </w:p>
           <w:p>
@@ -194,7 +162,7 @@
                 <w:sz w:val="16"/>
                 <w:u w:val="none"/>
               </w:rPr>
-              <w:t>현재까지 비용은 약 $5.3이며, 전체 실행을 마치면 약 $12가 들 것으로 예상함. 코드는 GitHub(PassionChicken-Leesuin/Advanced-Agentic-TRM)에 공개함.</w:t>
+              <w:t>전체 실행까지 포함한 비용은 약 $10.1임(전체 실행 180건 $5.47). 코드는 GitHub(PassionChicken-Leesuin/Advanced-Agentic-TRM)에 공개함.</w:t>
             </w:r>
           </w:p>
         </w:tc>
@@ -4494,7 +4462,7 @@
           <w:sz w:val="20"/>
           <w:u w:val="none"/>
         </w:rPr>
-        <w:t>6.3 파일럿 D의 KB 사용 전후 비교</w:t>
+        <w:t>6.3 전체 실행의 KB 사용 전후 비교</w:t>
       </w:r>
     </w:p>
     <w:p>
@@ -4507,7 +4475,7 @@
           <w:sz w:val="20"/>
           <w:u w:val="none"/>
         </w:rPr>
-        <w:t>&lt;표 7&gt; 파일럿 D 결과 (KB 문서 20건)</w:t>
+        <w:t>&lt;표 7&gt; 전체 실행 결과 (KB 문서 180건)</w:t>
       </w:r>
     </w:p>
     <w:tbl>
@@ -4612,13 +4580,7 @@
             <w:tcW w:type="dxa" w:w="2900"/>
           </w:tcPr>
           <w:p>
-            <w:r/>
-            <w:r>
-              <w:rPr>
-                <w:b w:val="0"/>
-                <w:sz w:val="16"/>
-                <w:u w:val="none"/>
-              </w:rPr>
+            <w:r>
               <w:t>30</w:t>
             </w:r>
           </w:p>
@@ -4628,14 +4590,8 @@
             <w:tcW w:type="dxa" w:w="2916"/>
           </w:tcPr>
           <w:p>
-            <w:r/>
-            <w:r>
-              <w:rPr>
-                <w:b w:val="0"/>
-                <w:sz w:val="16"/>
-                <w:u w:val="none"/>
-              </w:rPr>
-              <w:t>36</w:t>
+            <w:r>
+              <w:t>30</w:t>
             </w:r>
           </w:p>
         </w:tc>
@@ -4666,13 +4622,7 @@
             <w:tcW w:type="dxa" w:w="2900"/>
           </w:tcPr>
           <w:p>
-            <w:r/>
-            <w:r>
-              <w:rPr>
-                <w:b w:val="0"/>
-                <w:sz w:val="16"/>
-                <w:u w:val="none"/>
-              </w:rPr>
+            <w:r>
               <w:t>0</w:t>
             </w:r>
           </w:p>
@@ -4682,14 +4632,8 @@
             <w:tcW w:type="dxa" w:w="2916"/>
           </w:tcPr>
           <w:p>
-            <w:r/>
-            <w:r>
-              <w:rPr>
-                <w:b w:val="0"/>
-                <w:sz w:val="16"/>
-                <w:u w:val="none"/>
-              </w:rPr>
-              <w:t>33</w:t>
+            <w:r>
+              <w:t>29</w:t>
             </w:r>
           </w:p>
         </w:tc>
@@ -4719,13 +4663,7 @@
             <w:tcW w:type="dxa" w:w="2900"/>
           </w:tcPr>
           <w:p>
-            <w:r/>
-            <w:r>
-              <w:rPr>
-                <w:b w:val="0"/>
-                <w:sz w:val="16"/>
-                <w:u w:val="none"/>
-              </w:rPr>
+            <w:r>
               <w:t>—</w:t>
             </w:r>
           </w:p>
@@ -4735,14 +4673,8 @@
             <w:tcW w:type="dxa" w:w="2916"/>
           </w:tcPr>
           <w:p>
-            <w:r/>
-            <w:r>
-              <w:rPr>
-                <w:b w:val="0"/>
-                <w:sz w:val="16"/>
-                <w:u w:val="none"/>
-              </w:rPr>
-              <w:t>엄격 89% / 관대 100%</w:t>
+            <w:r>
+              <w:t>엄격 93% / 관대 100%</w:t>
             </w:r>
           </w:p>
         </w:tc>
@@ -4773,13 +4705,7 @@
             <w:tcW w:type="dxa" w:w="2900"/>
           </w:tcPr>
           <w:p>
-            <w:r/>
-            <w:r>
-              <w:rPr>
-                <w:b w:val="0"/>
-                <w:sz w:val="16"/>
-                <w:u w:val="none"/>
-              </w:rPr>
+            <w:r>
               <w:t>—</w:t>
             </w:r>
           </w:p>
@@ -4789,14 +4715,8 @@
             <w:tcW w:type="dxa" w:w="2916"/>
           </w:tcPr>
           <w:p>
-            <w:r/>
-            <w:r>
-              <w:rPr>
-                <w:b w:val="0"/>
-                <w:sz w:val="16"/>
-                <w:u w:val="none"/>
-              </w:rPr>
-              <w:t>신규 23(전부 근거 있음) · 세분화 8 · 동일 1 · 일반화 4 · 탈락 17</w:t>
+            <w:r>
+              <w:t>신규 16(근거 있음 16) · 세분화 8 · 동일 3 · 일반화 3 · 탈락 16</w:t>
             </w:r>
           </w:p>
         </w:tc>
@@ -4827,13 +4747,7 @@
             <w:tcW w:type="dxa" w:w="2900"/>
           </w:tcPr>
           <w:p>
-            <w:r/>
-            <w:r>
-              <w:rPr>
-                <w:b w:val="0"/>
-                <w:sz w:val="16"/>
-                <w:u w:val="none"/>
-              </w:rPr>
+            <w:r>
               <w:t>21% / 53%</w:t>
             </w:r>
           </w:p>
@@ -4843,14 +4757,8 @@
             <w:tcW w:type="dxa" w:w="2916"/>
           </w:tcPr>
           <w:p>
-            <w:r/>
-            <w:r>
-              <w:rPr>
-                <w:b w:val="0"/>
-                <w:sz w:val="16"/>
-                <w:u w:val="none"/>
-              </w:rPr>
-              <w:t>21% / 42%</w:t>
+            <w:r>
+              <w:t>37% / 47%</w:t>
             </w:r>
           </w:p>
         </w:tc>
@@ -4880,13 +4788,7 @@
             <w:tcW w:type="dxa" w:w="2900"/>
           </w:tcPr>
           <w:p>
-            <w:r/>
-            <w:r>
-              <w:rPr>
-                <w:b w:val="0"/>
-                <w:sz w:val="16"/>
-                <w:u w:val="none"/>
-              </w:rPr>
+            <w:r>
               <w:t>60%</w:t>
             </w:r>
           </w:p>
@@ -4896,13 +4798,7 @@
             <w:tcW w:type="dxa" w:w="2916"/>
           </w:tcPr>
           <w:p>
-            <w:r/>
-            <w:r>
-              <w:rPr>
-                <w:b w:val="0"/>
-                <w:sz w:val="16"/>
-                <w:u w:val="none"/>
-              </w:rPr>
+            <w:r>
               <w:t>50%</w:t>
             </w:r>
           </w:p>
@@ -4934,14 +4830,8 @@
             <w:tcW w:type="dxa" w:w="2900"/>
           </w:tcPr>
           <w:p>
-            <w:r/>
-            <w:r>
-              <w:rPr>
-                <w:b w:val="0"/>
-                <w:sz w:val="16"/>
-                <w:u w:val="none"/>
-              </w:rPr>
-              <w:t>3.25년</w:t>
+            <w:r>
+              <w:t>3.75년</w:t>
             </w:r>
           </w:p>
         </w:tc>
@@ -4950,14 +4840,80 @@
             <w:tcW w:type="dxa" w:w="2916"/>
           </w:tcPr>
           <w:p>
-            <w:r/>
-            <w:r>
-              <w:rPr>
-                <w:b w:val="0"/>
-                <w:sz w:val="16"/>
-                <w:u w:val="none"/>
-              </w:rPr>
-              <w:t>1.0년</w:t>
+            <w:r>
+              <w:t>1.71년</w:t>
+            </w:r>
+          </w:p>
+        </w:tc>
+      </w:tr>
+      <w:tr>
+        <w:trPr>
+          <w:cantSplit/>
+        </w:trPr>
+        <w:tc>
+          <w:tcPr>
+            <w:tcW w:type="dxa" w:w="3200"/>
+            <w:shd w:val="clear" w:color="auto" w:fill="FAE2D5"/>
+          </w:tcPr>
+          <w:p>
+            <w:r>
+              <w:t>모순 탐지율 (모순 쌍 3개)</w:t>
+            </w:r>
+          </w:p>
+        </w:tc>
+        <w:tc>
+          <w:tcPr>
+            <w:tcW w:type="dxa" w:w="2900"/>
+          </w:tcPr>
+          <w:p>
+            <w:r>
+              <w:t>—</w:t>
+            </w:r>
+          </w:p>
+        </w:tc>
+        <w:tc>
+          <w:tcPr>
+            <w:tcW w:type="dxa" w:w="2916"/>
+          </w:tcPr>
+          <w:p>
+            <w:r>
+              <w:t>100% (양쪽 회수된 3쌍 기준)</w:t>
+            </w:r>
+          </w:p>
+        </w:tc>
+      </w:tr>
+      <w:tr>
+        <w:trPr>
+          <w:cantSplit/>
+        </w:trPr>
+        <w:tc>
+          <w:tcPr>
+            <w:tcW w:type="dxa" w:w="3200"/>
+            <w:shd w:val="clear" w:color="auto" w:fill="FAE2D5"/>
+          </w:tcPr>
+          <w:p>
+            <w:r>
+              <w:t>2020년판 recall (관대)</w:t>
+            </w:r>
+          </w:p>
+        </w:tc>
+        <w:tc>
+          <w:tcPr>
+            <w:tcW w:type="dxa" w:w="2900"/>
+          </w:tcPr>
+          <w:p>
+            <w:r>
+              <w:t>44%</w:t>
+            </w:r>
+          </w:p>
+        </w:tc>
+        <w:tc>
+          <w:tcPr>
+            <w:tcW w:type="dxa" w:w="2916"/>
+          </w:tcPr>
+          <w:p>
+            <w:r>
+              <w:t>44%</w:t>
             </w:r>
           </w:p>
         </w:tc>
@@ -4983,7 +4939,7 @@
           <w:sz w:val="16"/>
           <w:u w:val="none"/>
         </w:rPr>
-        <w:t>문서 20건으로 진행한 파일럿에서는 Advanced가 Harbor 칩 로트, Northfield 파일럿, 공급사 납기 등 가상 내부자료의 세부 내용을 많이 반영함. 공식 마일스톤 재현율은 Initial보다 낮았음. KB에 담긴 자료를 충실히 반영한 결과로 볼 수 있음. 근거 문서를 인용한 항목은 Initial의 0개에서 Advanced의 36개 중 33개로 늘었고, 연도 오차도 3.25년에서 1.0년으로 줄었음.</w:t>
+        <w:t>문서 180건 전체 실행에서 Advanced는 30개 항목 중 29개에 근거 문서를 인용했고(Initial 0개), 연도 오차는 3.75년에서 1.71년으로 줄었음. 공식 마일스톤 재현율(관대)은 Initial 53%, Advanced 47%로 Initial이 아직 높았음. 항목 변화는 신규 16건(근거 있음 16건), 세분화 8건, 탈락 16건임.</w:t>
       </w:r>
     </w:p>
     <w:p>
@@ -5001,7 +4957,7 @@
           <w:sz w:val="16"/>
           <w:u w:val="none"/>
         </w:rPr>
-        <w:t>파일럿에서는 모순 탐지율을 계산하지 못함. 모순된 내용 두 가지가 같은 20건 안에 함께 들어 있지 않았기 때문이며, 전체 실행에서 측정할 예정임.</w:t>
+        <w:t>모순 탐지율은 사전에 정한 모순 쌍 3개 가운데 양쪽 사실이 모두 KB에 회수된 쌍에서 Critic이 conflict를 표시한 비율임. 전체 실행 결과: 100% (양쪽 회수된 3쌍 기준).</w:t>
       </w:r>
     </w:p>
     <w:p>
@@ -5016,7 +4972,7 @@
           <w:highlight w:val="yellow"/>
           <w:u w:val="none"/>
         </w:rPr>
-        <w:t>→ 공식 로드맵과의 비교는 180건 전체 실행이 끝난 뒤 다시 확인할 필요가 있음. 20건 파일럿만으로 Advanced의 공식 마일스톤 재현율을 판단하기는 어려움. 전체 실행에서도 재현율이 낮다면 연산 ⑦의 우선순위를 조정해 공개 자료의 주요 마일스톤이 내부자료의 세부 항목보다 먼저 반영되도록 보완할 계획임.</w:t>
+        <w:t>→ 전체 실행에서 확인된 KB의 효과는 근거가 붙은 항목 수와 시점 정확도에서 가장 뚜렷함. 공식 마일스톤 재현율은 아직 Initial보다 낮아, 연산 ⑦의 우선순위를 조정해 공개 자료의 주요 마일스톤이 내부자료의 세부 항목보다 먼저 반영되도록 보완할 계획임.</w:t>
       </w:r>
     </w:p>
     <w:p>
@@ -5089,7 +5045,7 @@
           <w:sz w:val="18"/>
           <w:u w:val="none"/>
         </w:rPr>
-        <w:t>&lt;그림 1&gt; 2막 지식베이스 구축 화면 (파일럿 D, 문서 20건 처리 후)</w:t>
+        <w:t>&lt;그림 1&gt; 2막 지식베이스 구축 화면 (전체 실행, 문서 180건 처리 후)</w:t>
       </w:r>
     </w:p>
     <w:p>
@@ -5177,7 +5133,7 @@
           <w:sz w:val="18"/>
           <w:u w:val="none"/>
         </w:rPr>
-        <w:t>&lt;그림 2&gt; Initial(왼쪽)·Advanced(오른쪽) 로드맵과 항목 변화 표시</w:t>
+        <w:t>&lt;그림 2&gt; Initial(왼쪽)·Advanced(오른쪽) 로드맵과 항목 변화 표시 (전체 실행)</w:t>
       </w:r>
     </w:p>
     <w:p>
@@ -5393,14 +5349,8 @@
             <w:tcW w:type="dxa" w:w="3016"/>
           </w:tcPr>
           <w:p>
-            <w:r/>
-            <w:r>
-              <w:rPr>
-                <w:b w:val="0"/>
-                <w:sz w:val="16"/>
-                <w:u w:val="none"/>
-              </w:rPr>
-              <w:t>약 $0.35</w:t>
+            <w:r>
+              <w:t>약 $0.46</w:t>
             </w:r>
           </w:p>
         </w:tc>
@@ -5415,14 +5365,8 @@
             <w:shd w:val="clear" w:color="auto" w:fill="FAE2D5"/>
           </w:tcPr>
           <w:p>
-            <w:r/>
-            <w:r>
-              <w:rPr>
-                <w:b/>
-                <w:sz w:val="16"/>
-                <w:u w:val="none"/>
-              </w:rPr>
-              <w:t>전체 실행 180건 (진행 중, 문서당 약 $0.035)</w:t>
+            <w:r>
+              <w:t>전체 실행 180건 (완료, 문서당 약 $0.030)</w:t>
             </w:r>
           </w:p>
         </w:tc>
@@ -5431,14 +5375,8 @@
             <w:tcW w:type="dxa" w:w="3016"/>
           </w:tcPr>
           <w:p>
-            <w:r/>
-            <w:r>
-              <w:rPr>
-                <w:b w:val="0"/>
-                <w:sz w:val="16"/>
-                <w:u w:val="none"/>
-              </w:rPr>
-              <w:t>약 $6.3 예상</w:t>
+            <w:r>
+              <w:t>$5.47</w:t>
             </w:r>
           </w:p>
         </w:tc>
@@ -5453,14 +5391,8 @@
             <w:shd w:val="clear" w:color="auto" w:fill="FAE2D5"/>
           </w:tcPr>
           <w:p>
-            <w:r/>
-            <w:r>
-              <w:rPr>
-                <w:b/>
-                <w:sz w:val="16"/>
-                <w:u w:val="none"/>
-              </w:rPr>
-              <w:t>합계 (전체 실행 완료 시)</w:t>
+            <w:r>
+              <w:t>합계</w:t>
             </w:r>
           </w:p>
         </w:tc>
@@ -5469,14 +5401,8 @@
             <w:tcW w:type="dxa" w:w="3016"/>
           </w:tcPr>
           <w:p>
-            <w:r/>
-            <w:r>
-              <w:rPr>
-                <w:b w:val="0"/>
-                <w:sz w:val="16"/>
-                <w:u w:val="none"/>
-              </w:rPr>
-              <w:t>약 $11~12</w:t>
+            <w:r>
+              <w:t>약 $10.1</w:t>
             </w:r>
           </w:p>
         </w:tc>
@@ -5546,14 +5472,7 @@
           <w:sz w:val="16"/>
           <w:u w:val="none"/>
         </w:rPr>
-        <w:t>180건 전체 실행 후 회수율·모순 탐지율과 공식 로드맵 비교 결과를 반영해 &lt;표 7&gt;을 갱신할 예정임.</w:t>
-      </w:r>
-      <w:r>
-        <w:rPr>
-          <w:b/>
-          <w:sz w:val="16"/>
-          <w:u w:val="none"/>
-        </w:rPr>
+        <w:t>180건 전체 실행 결과를 &lt;표 7&gt;과 요약에 반영함. 남은 작업은 결과 해석과 본 실험 설계(지식 구조 조건별 비교)로의 연결임.</w:t>
       </w:r>
     </w:p>
     <w:p>

</xml_diff>